<commit_message>
Documentação | Correção MER
</commit_message>
<xml_diff>
--- a/DOCS/CDCP-Levantamento-Requisitos-Check.docx
+++ b/DOCS/CDCP-Levantamento-Requisitos-Check.docx
@@ -194,39 +194,8 @@
           <w:sz w:val="32"/>
           <w:szCs w:val="32"/>
         </w:rPr>
-        <w:t xml:space="preserve">2. </w:t>
+        <w:t>2. Atores do sistema</w:t>
       </w:r>
-      <w:proofErr w:type="spellStart"/>
-      <w:r>
-        <w:rPr>
-          <w:rFonts w:ascii="Arial" w:hAnsi="Arial" w:cs="Arial"/>
-          <w:color w:val="000000" w:themeColor="text1"/>
-          <w:sz w:val="32"/>
-          <w:szCs w:val="32"/>
-        </w:rPr>
-        <w:t>Atores</w:t>
-      </w:r>
-      <w:proofErr w:type="spellEnd"/>
-      <w:r>
-        <w:rPr>
-          <w:rFonts w:ascii="Arial" w:hAnsi="Arial" w:cs="Arial"/>
-          <w:color w:val="000000" w:themeColor="text1"/>
-          <w:sz w:val="32"/>
-          <w:szCs w:val="32"/>
-        </w:rPr>
-        <w:t xml:space="preserve"> do </w:t>
-      </w:r>
-      <w:proofErr w:type="spellStart"/>
-      <w:r>
-        <w:rPr>
-          <w:rFonts w:ascii="Arial" w:hAnsi="Arial" w:cs="Arial"/>
-          <w:color w:val="000000" w:themeColor="text1"/>
-          <w:sz w:val="32"/>
-          <w:szCs w:val="32"/>
-        </w:rPr>
-        <w:t>sistema</w:t>
-      </w:r>
-      <w:proofErr w:type="spellEnd"/>
     </w:p>
     <w:p>
       <w:pPr>
@@ -295,7 +264,6 @@
                 <w:rFonts w:ascii="Arial" w:hAnsi="Arial" w:cs="Arial"/>
               </w:rPr>
             </w:pPr>
-            <w:proofErr w:type="spellStart"/>
             <w:r>
               <w:rPr>
                 <w:rFonts w:ascii="Arial" w:hAnsi="Arial" w:cs="Arial"/>
@@ -303,7 +271,6 @@
               </w:rPr>
               <w:t>Ator</w:t>
             </w:r>
-            <w:proofErr w:type="spellEnd"/>
           </w:p>
         </w:tc>
         <w:tc>
@@ -323,7 +290,6 @@
                 <w:rFonts w:ascii="Arial" w:hAnsi="Arial" w:cs="Arial"/>
               </w:rPr>
             </w:pPr>
-            <w:proofErr w:type="spellStart"/>
             <w:r>
               <w:rPr>
                 <w:rFonts w:ascii="Arial" w:hAnsi="Arial" w:cs="Arial"/>
@@ -331,7 +297,6 @@
               </w:rPr>
               <w:t>Descrição</w:t>
             </w:r>
-            <w:proofErr w:type="spellEnd"/>
           </w:p>
         </w:tc>
       </w:tr>
@@ -386,16 +351,8 @@
               <w:rPr>
                 <w:rFonts w:ascii="Arial" w:hAnsi="Arial" w:cs="Arial"/>
               </w:rPr>
-              <w:t>Pessoa/</w:t>
-            </w:r>
-            <w:proofErr w:type="spellStart"/>
-            <w:r>
-              <w:rPr>
-                <w:rFonts w:ascii="Arial" w:hAnsi="Arial" w:cs="Arial"/>
-              </w:rPr>
-              <w:t>Cidadão</w:t>
-            </w:r>
-            <w:proofErr w:type="spellEnd"/>
+              <w:t>Pessoa/Cidadão</w:t>
+            </w:r>
           </w:p>
         </w:tc>
         <w:tc>
@@ -561,16 +518,8 @@
               <w:rPr>
                 <w:rFonts w:ascii="Arial" w:hAnsi="Arial" w:cs="Arial"/>
               </w:rPr>
-              <w:t xml:space="preserve">Gestor </w:t>
-            </w:r>
-            <w:proofErr w:type="spellStart"/>
-            <w:r>
-              <w:rPr>
-                <w:rFonts w:ascii="Arial" w:hAnsi="Arial" w:cs="Arial"/>
-              </w:rPr>
-              <w:t>Comum</w:t>
-            </w:r>
-            <w:proofErr w:type="spellEnd"/>
+              <w:t>Gestor Comum</w:t>
+            </w:r>
           </w:p>
         </w:tc>
         <w:tc>
@@ -652,21 +601,7 @@
               <w:rPr>
                 <w:rFonts w:ascii="Arial" w:hAnsi="Arial" w:cs="Arial"/>
               </w:rPr>
-              <w:t xml:space="preserve">Gestor da </w:t>
-            </w:r>
-            <w:proofErr w:type="spellStart"/>
-            <w:r>
-              <w:rPr>
-                <w:rFonts w:ascii="Arial" w:hAnsi="Arial" w:cs="Arial"/>
-              </w:rPr>
-              <w:t>Unidade</w:t>
-            </w:r>
-            <w:proofErr w:type="spellEnd"/>
-            <w:r>
-              <w:rPr>
-                <w:rFonts w:ascii="Arial" w:hAnsi="Arial" w:cs="Arial"/>
-              </w:rPr>
-              <w:t xml:space="preserve"> (ADMUNIDADE)</w:t>
+              <w:t>Gestor da Unidade (ADMUNIDADE)</w:t>
             </w:r>
           </w:p>
         </w:tc>
@@ -745,33 +680,11 @@
                 <w:rFonts w:ascii="Arial" w:hAnsi="Arial" w:cs="Arial"/>
               </w:rPr>
             </w:pPr>
-            <w:proofErr w:type="spellStart"/>
-            <w:r>
-              <w:rPr>
-                <w:rFonts w:ascii="Arial" w:hAnsi="Arial" w:cs="Arial"/>
-              </w:rPr>
-              <w:t>Administrador</w:t>
-            </w:r>
-            <w:proofErr w:type="spellEnd"/>
-            <w:r>
-              <w:rPr>
-                <w:rFonts w:ascii="Arial" w:hAnsi="Arial" w:cs="Arial"/>
-              </w:rPr>
-              <w:t xml:space="preserve"> </w:t>
-            </w:r>
-            <w:proofErr w:type="spellStart"/>
-            <w:r>
-              <w:rPr>
-                <w:rFonts w:ascii="Arial" w:hAnsi="Arial" w:cs="Arial"/>
-              </w:rPr>
-              <w:t>Geral</w:t>
-            </w:r>
-            <w:proofErr w:type="spellEnd"/>
-            <w:r>
-              <w:rPr>
-                <w:rFonts w:ascii="Arial" w:hAnsi="Arial" w:cs="Arial"/>
-              </w:rPr>
-              <w:t xml:space="preserve"> do Sistema</w:t>
+            <w:r>
+              <w:rPr>
+                <w:rFonts w:ascii="Arial" w:hAnsi="Arial" w:cs="Arial"/>
+              </w:rPr>
+              <w:t>Administrador Geral do Sistema</w:t>
             </w:r>
           </w:p>
         </w:tc>
@@ -933,19 +846,11 @@
                 <w:rFonts w:ascii="Arial" w:hAnsi="Arial" w:cs="Arial"/>
               </w:rPr>
             </w:pPr>
-            <w:proofErr w:type="spellStart"/>
-            <w:r>
-              <w:rPr>
-                <w:rFonts w:ascii="Arial" w:hAnsi="Arial" w:cs="Arial"/>
-              </w:rPr>
-              <w:t>Modelo</w:t>
-            </w:r>
-            <w:proofErr w:type="spellEnd"/>
-            <w:r>
-              <w:rPr>
-                <w:rFonts w:ascii="Arial" w:hAnsi="Arial" w:cs="Arial"/>
-              </w:rPr>
-              <w:t xml:space="preserve"> de IA</w:t>
+            <w:r>
+              <w:rPr>
+                <w:rFonts w:ascii="Arial" w:hAnsi="Arial" w:cs="Arial"/>
+              </w:rPr>
+              <w:t>Modelo de IA</w:t>
             </w:r>
           </w:p>
         </w:tc>
@@ -1024,28 +929,12 @@
                 <w:rFonts w:ascii="Arial" w:hAnsi="Arial" w:cs="Arial"/>
               </w:rPr>
             </w:pPr>
-            <w:proofErr w:type="spellStart"/>
-            <w:r>
-              <w:rPr>
-                <w:rFonts w:ascii="Arial" w:hAnsi="Arial" w:cs="Arial"/>
-              </w:rPr>
-              <w:t>Serviço</w:t>
-            </w:r>
-            <w:proofErr w:type="spellEnd"/>
-            <w:r>
-              <w:rPr>
-                <w:rFonts w:ascii="Arial" w:hAnsi="Arial" w:cs="Arial"/>
-              </w:rPr>
-              <w:t xml:space="preserve"> de </w:t>
-            </w:r>
-            <w:proofErr w:type="spellStart"/>
-            <w:r>
-              <w:rPr>
-                <w:rFonts w:ascii="Arial" w:hAnsi="Arial" w:cs="Arial"/>
-              </w:rPr>
-              <w:t>Mensageria</w:t>
-            </w:r>
-            <w:proofErr w:type="spellEnd"/>
+            <w:r>
+              <w:rPr>
+                <w:rFonts w:ascii="Arial" w:hAnsi="Arial" w:cs="Arial"/>
+              </w:rPr>
+              <w:t>Serviço de Mensageria</w:t>
+            </w:r>
           </w:p>
         </w:tc>
         <w:tc>
@@ -1102,39 +991,8 @@
           <w:sz w:val="32"/>
           <w:szCs w:val="32"/>
         </w:rPr>
-        <w:t xml:space="preserve">3. </w:t>
+        <w:t>3. Requisitos funcionais</w:t>
       </w:r>
-      <w:proofErr w:type="spellStart"/>
-      <w:r>
-        <w:rPr>
-          <w:rFonts w:ascii="Arial" w:hAnsi="Arial" w:cs="Arial"/>
-          <w:color w:val="000000" w:themeColor="text1"/>
-          <w:sz w:val="32"/>
-          <w:szCs w:val="32"/>
-        </w:rPr>
-        <w:t>Requisitos</w:t>
-      </w:r>
-      <w:proofErr w:type="spellEnd"/>
-      <w:r>
-        <w:rPr>
-          <w:rFonts w:ascii="Arial" w:hAnsi="Arial" w:cs="Arial"/>
-          <w:color w:val="000000" w:themeColor="text1"/>
-          <w:sz w:val="32"/>
-          <w:szCs w:val="32"/>
-        </w:rPr>
-        <w:t xml:space="preserve"> </w:t>
-      </w:r>
-      <w:proofErr w:type="spellStart"/>
-      <w:r>
-        <w:rPr>
-          <w:rFonts w:ascii="Arial" w:hAnsi="Arial" w:cs="Arial"/>
-          <w:color w:val="000000" w:themeColor="text1"/>
-          <w:sz w:val="32"/>
-          <w:szCs w:val="32"/>
-        </w:rPr>
-        <w:t>funcionais</w:t>
-      </w:r>
-      <w:proofErr w:type="spellEnd"/>
     </w:p>
     <w:p>
       <w:pPr>
@@ -1156,33 +1014,8 @@
           <w:rFonts w:ascii="Arial" w:hAnsi="Arial" w:cs="Arial"/>
           <w:color w:val="000000" w:themeColor="text1"/>
         </w:rPr>
-        <w:t xml:space="preserve">3.1 </w:t>
+        <w:t>3.1 Autenticação — Cidadão</w:t>
       </w:r>
-      <w:proofErr w:type="spellStart"/>
-      <w:r>
-        <w:rPr>
-          <w:rFonts w:ascii="Arial" w:hAnsi="Arial" w:cs="Arial"/>
-          <w:color w:val="000000" w:themeColor="text1"/>
-        </w:rPr>
-        <w:t>Autenticação</w:t>
-      </w:r>
-      <w:proofErr w:type="spellEnd"/>
-      <w:r>
-        <w:rPr>
-          <w:rFonts w:ascii="Arial" w:hAnsi="Arial" w:cs="Arial"/>
-          <w:color w:val="000000" w:themeColor="text1"/>
-        </w:rPr>
-        <w:t xml:space="preserve"> — </w:t>
-      </w:r>
-      <w:proofErr w:type="spellStart"/>
-      <w:r>
-        <w:rPr>
-          <w:rFonts w:ascii="Arial" w:hAnsi="Arial" w:cs="Arial"/>
-          <w:color w:val="000000" w:themeColor="text1"/>
-        </w:rPr>
-        <w:t>Cidadão</w:t>
-      </w:r>
-      <w:proofErr w:type="spellEnd"/>
     </w:p>
     <w:tbl>
       <w:tblPr>
@@ -1244,7 +1077,6 @@
                 <w:rFonts w:ascii="Arial" w:hAnsi="Arial" w:cs="Arial"/>
               </w:rPr>
             </w:pPr>
-            <w:proofErr w:type="spellStart"/>
             <w:r>
               <w:rPr>
                 <w:rFonts w:ascii="Arial" w:hAnsi="Arial" w:cs="Arial"/>
@@ -1252,7 +1084,6 @@
               </w:rPr>
               <w:t>Requisito</w:t>
             </w:r>
-            <w:proofErr w:type="spellEnd"/>
           </w:p>
         </w:tc>
         <w:tc>
@@ -1603,6 +1434,13 @@
                 <w:lang w:val="pt-BR"/>
               </w:rPr>
             </w:pPr>
+            <w:r>
+              <w:rPr>
+                <w:rFonts w:ascii="Arial" w:hAnsi="Arial" w:cs="Arial"/>
+                <w:lang w:val="pt-BR"/>
+              </w:rPr>
+              <w:t>X</w:t>
+            </w:r>
           </w:p>
         </w:tc>
       </w:tr>
@@ -1716,6 +1554,13 @@
                 <w:lang w:val="pt-BR"/>
               </w:rPr>
             </w:pPr>
+            <w:r>
+              <w:rPr>
+                <w:rFonts w:ascii="Arial" w:hAnsi="Arial" w:cs="Arial"/>
+                <w:lang w:val="pt-BR"/>
+              </w:rPr>
+              <w:t>X</w:t>
+            </w:r>
           </w:p>
         </w:tc>
       </w:tr>
@@ -1949,6 +1794,13 @@
                 <w:lang w:val="pt-BR"/>
               </w:rPr>
             </w:pPr>
+            <w:r>
+              <w:rPr>
+                <w:rFonts w:ascii="Arial" w:hAnsi="Arial" w:cs="Arial"/>
+                <w:lang w:val="pt-BR"/>
+              </w:rPr>
+              <w:t>X</w:t>
+            </w:r>
           </w:p>
         </w:tc>
       </w:tr>
@@ -1974,17 +1826,8 @@
           <w:rFonts w:ascii="Arial" w:hAnsi="Arial" w:cs="Arial"/>
           <w:color w:val="000000" w:themeColor="text1"/>
         </w:rPr>
-        <w:t xml:space="preserve">3.2 Home — </w:t>
+        <w:t>3.2 Home — Cidadão</w:t>
       </w:r>
-      <w:proofErr w:type="spellStart"/>
-      <w:r>
-        <w:rPr>
-          <w:rFonts w:ascii="Arial" w:hAnsi="Arial" w:cs="Arial"/>
-          <w:color w:val="000000" w:themeColor="text1"/>
-        </w:rPr>
-        <w:t>Cidadão</w:t>
-      </w:r>
-      <w:proofErr w:type="spellEnd"/>
     </w:p>
     <w:tbl>
       <w:tblPr>
@@ -2046,7 +1889,6 @@
                 <w:rFonts w:ascii="Arial" w:hAnsi="Arial" w:cs="Arial"/>
               </w:rPr>
             </w:pPr>
-            <w:proofErr w:type="spellStart"/>
             <w:r>
               <w:rPr>
                 <w:rFonts w:ascii="Arial" w:hAnsi="Arial" w:cs="Arial"/>
@@ -2054,7 +1896,6 @@
               </w:rPr>
               <w:t>Requisito</w:t>
             </w:r>
-            <w:proofErr w:type="spellEnd"/>
           </w:p>
         </w:tc>
         <w:tc>
@@ -2351,65 +2192,8 @@
           <w:color w:val="000000" w:themeColor="text1"/>
         </w:rPr>
         <w:lastRenderedPageBreak/>
-        <w:t xml:space="preserve">3.3 </w:t>
+        <w:t>3.3 Gerenciamento de chamados pelo cidadão</w:t>
       </w:r>
-      <w:proofErr w:type="spellStart"/>
-      <w:r>
-        <w:rPr>
-          <w:rFonts w:ascii="Arial" w:hAnsi="Arial" w:cs="Arial"/>
-          <w:color w:val="000000" w:themeColor="text1"/>
-        </w:rPr>
-        <w:t>Gerenciamento</w:t>
-      </w:r>
-      <w:proofErr w:type="spellEnd"/>
-      <w:r>
-        <w:rPr>
-          <w:rFonts w:ascii="Arial" w:hAnsi="Arial" w:cs="Arial"/>
-          <w:color w:val="000000" w:themeColor="text1"/>
-        </w:rPr>
-        <w:t xml:space="preserve"> de </w:t>
-      </w:r>
-      <w:proofErr w:type="spellStart"/>
-      <w:r>
-        <w:rPr>
-          <w:rFonts w:ascii="Arial" w:hAnsi="Arial" w:cs="Arial"/>
-          <w:color w:val="000000" w:themeColor="text1"/>
-        </w:rPr>
-        <w:t>chamados</w:t>
-      </w:r>
-      <w:proofErr w:type="spellEnd"/>
-      <w:r>
-        <w:rPr>
-          <w:rFonts w:ascii="Arial" w:hAnsi="Arial" w:cs="Arial"/>
-          <w:color w:val="000000" w:themeColor="text1"/>
-        </w:rPr>
-        <w:t xml:space="preserve"> </w:t>
-      </w:r>
-      <w:proofErr w:type="spellStart"/>
-      <w:r>
-        <w:rPr>
-          <w:rFonts w:ascii="Arial" w:hAnsi="Arial" w:cs="Arial"/>
-          <w:color w:val="000000" w:themeColor="text1"/>
-        </w:rPr>
-        <w:t>pelo</w:t>
-      </w:r>
-      <w:proofErr w:type="spellEnd"/>
-      <w:r>
-        <w:rPr>
-          <w:rFonts w:ascii="Arial" w:hAnsi="Arial" w:cs="Arial"/>
-          <w:color w:val="000000" w:themeColor="text1"/>
-        </w:rPr>
-        <w:t xml:space="preserve"> </w:t>
-      </w:r>
-      <w:proofErr w:type="spellStart"/>
-      <w:r>
-        <w:rPr>
-          <w:rFonts w:ascii="Arial" w:hAnsi="Arial" w:cs="Arial"/>
-          <w:color w:val="000000" w:themeColor="text1"/>
-        </w:rPr>
-        <w:t>cidadão</w:t>
-      </w:r>
-      <w:proofErr w:type="spellEnd"/>
     </w:p>
     <w:tbl>
       <w:tblPr>
@@ -2471,7 +2255,6 @@
                 <w:rFonts w:ascii="Arial" w:hAnsi="Arial" w:cs="Arial"/>
               </w:rPr>
             </w:pPr>
-            <w:proofErr w:type="spellStart"/>
             <w:r>
               <w:rPr>
                 <w:rFonts w:ascii="Arial" w:hAnsi="Arial" w:cs="Arial"/>
@@ -2479,7 +2262,6 @@
               </w:rPr>
               <w:t>Requisito</w:t>
             </w:r>
-            <w:proofErr w:type="spellEnd"/>
           </w:p>
         </w:tc>
         <w:tc>
@@ -2593,6 +2375,13 @@
                 <w:lang w:val="pt-BR"/>
               </w:rPr>
             </w:pPr>
+            <w:r>
+              <w:rPr>
+                <w:rFonts w:ascii="Arial" w:hAnsi="Arial" w:cs="Arial"/>
+                <w:lang w:val="pt-BR"/>
+              </w:rPr>
+              <w:t>X</w:t>
+            </w:r>
           </w:p>
         </w:tc>
       </w:tr>
@@ -2890,6 +2679,13 @@
                 <w:lang w:val="pt-BR"/>
               </w:rPr>
             </w:pPr>
+            <w:r>
+              <w:rPr>
+                <w:rFonts w:ascii="Arial" w:hAnsi="Arial" w:cs="Arial"/>
+                <w:lang w:val="pt-BR"/>
+              </w:rPr>
+              <w:t>X</w:t>
+            </w:r>
           </w:p>
         </w:tc>
       </w:tr>
@@ -3159,6 +2955,13 @@
                 <w:lang w:val="pt-BR"/>
               </w:rPr>
             </w:pPr>
+            <w:r>
+              <w:rPr>
+                <w:rFonts w:ascii="Arial" w:hAnsi="Arial" w:cs="Arial"/>
+                <w:lang w:val="pt-BR"/>
+              </w:rPr>
+              <w:t>X</w:t>
+            </w:r>
           </w:p>
         </w:tc>
       </w:tr>
@@ -3258,6 +3061,13 @@
                 <w:lang w:val="pt-BR"/>
               </w:rPr>
             </w:pPr>
+            <w:r>
+              <w:rPr>
+                <w:rFonts w:ascii="Arial" w:hAnsi="Arial" w:cs="Arial"/>
+                <w:lang w:val="pt-BR"/>
+              </w:rPr>
+              <w:t>X</w:t>
+            </w:r>
           </w:p>
         </w:tc>
       </w:tr>
@@ -3343,6 +3153,13 @@
                 <w:lang w:val="pt-BR"/>
               </w:rPr>
             </w:pPr>
+            <w:r>
+              <w:rPr>
+                <w:rFonts w:ascii="Arial" w:hAnsi="Arial" w:cs="Arial"/>
+                <w:lang w:val="pt-BR"/>
+              </w:rPr>
+              <w:t>X</w:t>
+            </w:r>
           </w:p>
         </w:tc>
       </w:tr>
@@ -3433,7 +3250,6 @@
                 <w:rFonts w:ascii="Arial" w:hAnsi="Arial" w:cs="Arial"/>
               </w:rPr>
             </w:pPr>
-            <w:proofErr w:type="spellStart"/>
             <w:r>
               <w:rPr>
                 <w:rFonts w:ascii="Arial" w:hAnsi="Arial" w:cs="Arial"/>
@@ -3441,7 +3257,6 @@
               </w:rPr>
               <w:t>Requisito</w:t>
             </w:r>
-            <w:proofErr w:type="spellEnd"/>
           </w:p>
         </w:tc>
         <w:tc>
@@ -4684,55 +4499,7 @@
           <w:rFonts w:ascii="Arial" w:hAnsi="Arial" w:cs="Arial"/>
           <w:color w:val="000000" w:themeColor="text1"/>
         </w:rPr>
-        <w:t xml:space="preserve">3.5 </w:t>
-      </w:r>
-      <w:proofErr w:type="spellStart"/>
-      <w:r>
-        <w:rPr>
-          <w:rFonts w:ascii="Arial" w:hAnsi="Arial" w:cs="Arial"/>
-          <w:color w:val="000000" w:themeColor="text1"/>
-        </w:rPr>
-        <w:t>Classificação</w:t>
-      </w:r>
-      <w:proofErr w:type="spellEnd"/>
-      <w:r>
-        <w:rPr>
-          <w:rFonts w:ascii="Arial" w:hAnsi="Arial" w:cs="Arial"/>
-          <w:color w:val="000000" w:themeColor="text1"/>
-        </w:rPr>
-        <w:t xml:space="preserve"> de </w:t>
-      </w:r>
-      <w:proofErr w:type="spellStart"/>
-      <w:r>
-        <w:rPr>
-          <w:rFonts w:ascii="Arial" w:hAnsi="Arial" w:cs="Arial"/>
-          <w:color w:val="000000" w:themeColor="text1"/>
-        </w:rPr>
-        <w:t>urgência</w:t>
-      </w:r>
-      <w:proofErr w:type="spellEnd"/>
-      <w:r>
-        <w:rPr>
-          <w:rFonts w:ascii="Arial" w:hAnsi="Arial" w:cs="Arial"/>
-          <w:color w:val="000000" w:themeColor="text1"/>
-        </w:rPr>
-        <w:t xml:space="preserve"> </w:t>
-      </w:r>
-      <w:proofErr w:type="spellStart"/>
-      <w:r>
-        <w:rPr>
-          <w:rFonts w:ascii="Arial" w:hAnsi="Arial" w:cs="Arial"/>
-          <w:color w:val="000000" w:themeColor="text1"/>
-        </w:rPr>
-        <w:t>por</w:t>
-      </w:r>
-      <w:proofErr w:type="spellEnd"/>
-      <w:r>
-        <w:rPr>
-          <w:rFonts w:ascii="Arial" w:hAnsi="Arial" w:cs="Arial"/>
-          <w:color w:val="000000" w:themeColor="text1"/>
-        </w:rPr>
-        <w:t xml:space="preserve"> IA</w:t>
+        <w:t>3.5 Classificação de urgência por IA</w:t>
       </w:r>
     </w:p>
     <w:tbl>
@@ -4795,7 +4562,6 @@
                 <w:rFonts w:ascii="Arial" w:hAnsi="Arial" w:cs="Arial"/>
               </w:rPr>
             </w:pPr>
-            <w:proofErr w:type="spellStart"/>
             <w:r>
               <w:rPr>
                 <w:rFonts w:ascii="Arial" w:hAnsi="Arial" w:cs="Arial"/>
@@ -4803,7 +4569,6 @@
               </w:rPr>
               <w:t>Requisito</w:t>
             </w:r>
-            <w:proofErr w:type="spellEnd"/>
           </w:p>
         </w:tc>
         <w:tc>
@@ -5268,55 +5033,7 @@
           <w:rFonts w:ascii="Arial" w:hAnsi="Arial" w:cs="Arial"/>
           <w:color w:val="000000" w:themeColor="text1"/>
         </w:rPr>
-        <w:t xml:space="preserve">3.6 </w:t>
-      </w:r>
-      <w:proofErr w:type="spellStart"/>
-      <w:r>
-        <w:rPr>
-          <w:rFonts w:ascii="Arial" w:hAnsi="Arial" w:cs="Arial"/>
-          <w:color w:val="000000" w:themeColor="text1"/>
-        </w:rPr>
-        <w:t>Fluxo</w:t>
-      </w:r>
-      <w:proofErr w:type="spellEnd"/>
-      <w:r>
-        <w:rPr>
-          <w:rFonts w:ascii="Arial" w:hAnsi="Arial" w:cs="Arial"/>
-          <w:color w:val="000000" w:themeColor="text1"/>
-        </w:rPr>
-        <w:t xml:space="preserve"> de </w:t>
-      </w:r>
-      <w:proofErr w:type="spellStart"/>
-      <w:r>
-        <w:rPr>
-          <w:rFonts w:ascii="Arial" w:hAnsi="Arial" w:cs="Arial"/>
-          <w:color w:val="000000" w:themeColor="text1"/>
-        </w:rPr>
-        <w:t>análise</w:t>
-      </w:r>
-      <w:proofErr w:type="spellEnd"/>
-      <w:r>
-        <w:rPr>
-          <w:rFonts w:ascii="Arial" w:hAnsi="Arial" w:cs="Arial"/>
-          <w:color w:val="000000" w:themeColor="text1"/>
-        </w:rPr>
-        <w:t xml:space="preserve"> </w:t>
-      </w:r>
-      <w:proofErr w:type="spellStart"/>
-      <w:r>
-        <w:rPr>
-          <w:rFonts w:ascii="Arial" w:hAnsi="Arial" w:cs="Arial"/>
-          <w:color w:val="000000" w:themeColor="text1"/>
-        </w:rPr>
-        <w:t>pelo</w:t>
-      </w:r>
-      <w:proofErr w:type="spellEnd"/>
-      <w:r>
-        <w:rPr>
-          <w:rFonts w:ascii="Arial" w:hAnsi="Arial" w:cs="Arial"/>
-          <w:color w:val="000000" w:themeColor="text1"/>
-        </w:rPr>
-        <w:t xml:space="preserve"> gestor</w:t>
+        <w:t>3.6 Fluxo de análise pelo gestor</w:t>
       </w:r>
     </w:p>
     <w:tbl>
@@ -5379,7 +5096,6 @@
                 <w:rFonts w:ascii="Arial" w:hAnsi="Arial" w:cs="Arial"/>
               </w:rPr>
             </w:pPr>
-            <w:proofErr w:type="spellStart"/>
             <w:r>
               <w:rPr>
                 <w:rFonts w:ascii="Arial" w:hAnsi="Arial" w:cs="Arial"/>
@@ -5387,7 +5103,6 @@
               </w:rPr>
               <w:t>Requisito</w:t>
             </w:r>
-            <w:proofErr w:type="spellEnd"/>
           </w:p>
         </w:tc>
         <w:tc>
@@ -6205,33 +5920,8 @@
           <w:rFonts w:ascii="Arial" w:hAnsi="Arial" w:cs="Arial"/>
           <w:color w:val="000000" w:themeColor="text1"/>
         </w:rPr>
-        <w:t xml:space="preserve">3.7 </w:t>
+        <w:t>3.7 Prioridade e urgência</w:t>
       </w:r>
-      <w:proofErr w:type="spellStart"/>
-      <w:r>
-        <w:rPr>
-          <w:rFonts w:ascii="Arial" w:hAnsi="Arial" w:cs="Arial"/>
-          <w:color w:val="000000" w:themeColor="text1"/>
-        </w:rPr>
-        <w:t>Prioridade</w:t>
-      </w:r>
-      <w:proofErr w:type="spellEnd"/>
-      <w:r>
-        <w:rPr>
-          <w:rFonts w:ascii="Arial" w:hAnsi="Arial" w:cs="Arial"/>
-          <w:color w:val="000000" w:themeColor="text1"/>
-        </w:rPr>
-        <w:t xml:space="preserve"> e </w:t>
-      </w:r>
-      <w:proofErr w:type="spellStart"/>
-      <w:r>
-        <w:rPr>
-          <w:rFonts w:ascii="Arial" w:hAnsi="Arial" w:cs="Arial"/>
-          <w:color w:val="000000" w:themeColor="text1"/>
-        </w:rPr>
-        <w:t>urgência</w:t>
-      </w:r>
-      <w:proofErr w:type="spellEnd"/>
     </w:p>
     <w:tbl>
       <w:tblPr>
@@ -6293,7 +5983,6 @@
                 <w:rFonts w:ascii="Arial" w:hAnsi="Arial" w:cs="Arial"/>
               </w:rPr>
             </w:pPr>
-            <w:proofErr w:type="spellStart"/>
             <w:r>
               <w:rPr>
                 <w:rFonts w:ascii="Arial" w:hAnsi="Arial" w:cs="Arial"/>
@@ -6301,7 +5990,6 @@
               </w:rPr>
               <w:t>Requisito</w:t>
             </w:r>
-            <w:proofErr w:type="spellEnd"/>
           </w:p>
         </w:tc>
         <w:tc>
@@ -6745,49 +6433,8 @@
           <w:rFonts w:ascii="Arial" w:hAnsi="Arial" w:cs="Arial"/>
           <w:color w:val="000000" w:themeColor="text1"/>
         </w:rPr>
-        <w:t xml:space="preserve">3.8 </w:t>
+        <w:t>3.8 Atendimento pelo técnico</w:t>
       </w:r>
-      <w:proofErr w:type="spellStart"/>
-      <w:r>
-        <w:rPr>
-          <w:rFonts w:ascii="Arial" w:hAnsi="Arial" w:cs="Arial"/>
-          <w:color w:val="000000" w:themeColor="text1"/>
-        </w:rPr>
-        <w:t>Atendimento</w:t>
-      </w:r>
-      <w:proofErr w:type="spellEnd"/>
-      <w:r>
-        <w:rPr>
-          <w:rFonts w:ascii="Arial" w:hAnsi="Arial" w:cs="Arial"/>
-          <w:color w:val="000000" w:themeColor="text1"/>
-        </w:rPr>
-        <w:t xml:space="preserve"> </w:t>
-      </w:r>
-      <w:proofErr w:type="spellStart"/>
-      <w:r>
-        <w:rPr>
-          <w:rFonts w:ascii="Arial" w:hAnsi="Arial" w:cs="Arial"/>
-          <w:color w:val="000000" w:themeColor="text1"/>
-        </w:rPr>
-        <w:t>pelo</w:t>
-      </w:r>
-      <w:proofErr w:type="spellEnd"/>
-      <w:r>
-        <w:rPr>
-          <w:rFonts w:ascii="Arial" w:hAnsi="Arial" w:cs="Arial"/>
-          <w:color w:val="000000" w:themeColor="text1"/>
-        </w:rPr>
-        <w:t xml:space="preserve"> </w:t>
-      </w:r>
-      <w:proofErr w:type="spellStart"/>
-      <w:r>
-        <w:rPr>
-          <w:rFonts w:ascii="Arial" w:hAnsi="Arial" w:cs="Arial"/>
-          <w:color w:val="000000" w:themeColor="text1"/>
-        </w:rPr>
-        <w:t>técnico</w:t>
-      </w:r>
-      <w:proofErr w:type="spellEnd"/>
     </w:p>
     <w:tbl>
       <w:tblPr>
@@ -6849,7 +6496,6 @@
                 <w:rFonts w:ascii="Arial" w:hAnsi="Arial" w:cs="Arial"/>
               </w:rPr>
             </w:pPr>
-            <w:proofErr w:type="spellStart"/>
             <w:r>
               <w:rPr>
                 <w:rFonts w:ascii="Arial" w:hAnsi="Arial" w:cs="Arial"/>
@@ -6857,7 +6503,6 @@
               </w:rPr>
               <w:t>Requisito</w:t>
             </w:r>
-            <w:proofErr w:type="spellEnd"/>
           </w:p>
         </w:tc>
         <w:tc>
@@ -7062,6 +6707,13 @@
                 <w:lang w:val="pt-BR"/>
               </w:rPr>
             </w:pPr>
+            <w:r>
+              <w:rPr>
+                <w:rFonts w:ascii="Arial" w:hAnsi="Arial" w:cs="Arial"/>
+                <w:lang w:val="pt-BR"/>
+              </w:rPr>
+              <w:t>X</w:t>
+            </w:r>
           </w:p>
         </w:tc>
       </w:tr>
@@ -7147,6 +6799,13 @@
                 <w:lang w:val="pt-BR"/>
               </w:rPr>
             </w:pPr>
+            <w:r>
+              <w:rPr>
+                <w:rFonts w:ascii="Arial" w:hAnsi="Arial" w:cs="Arial"/>
+                <w:lang w:val="pt-BR"/>
+              </w:rPr>
+              <w:t>X</w:t>
+            </w:r>
           </w:p>
         </w:tc>
       </w:tr>
@@ -7232,6 +6891,13 @@
                 <w:lang w:val="pt-BR"/>
               </w:rPr>
             </w:pPr>
+            <w:r>
+              <w:rPr>
+                <w:rFonts w:ascii="Arial" w:hAnsi="Arial" w:cs="Arial"/>
+                <w:lang w:val="pt-BR"/>
+              </w:rPr>
+              <w:t>X</w:t>
+            </w:r>
           </w:p>
         </w:tc>
       </w:tr>
@@ -7317,6 +6983,13 @@
                 <w:lang w:val="pt-BR"/>
               </w:rPr>
             </w:pPr>
+            <w:r>
+              <w:rPr>
+                <w:rFonts w:ascii="Arial" w:hAnsi="Arial" w:cs="Arial"/>
+                <w:lang w:val="pt-BR"/>
+              </w:rPr>
+              <w:t>X</w:t>
+            </w:r>
           </w:p>
         </w:tc>
       </w:tr>
@@ -7607,6 +7280,13 @@
                 <w:lang w:val="pt-BR"/>
               </w:rPr>
             </w:pPr>
+            <w:r>
+              <w:rPr>
+                <w:rFonts w:ascii="Arial" w:hAnsi="Arial" w:cs="Arial"/>
+                <w:lang w:val="pt-BR"/>
+              </w:rPr>
+              <w:t>X</w:t>
+            </w:r>
           </w:p>
         </w:tc>
       </w:tr>
@@ -7699,6 +7379,13 @@
                 <w:lang w:val="pt-BR"/>
               </w:rPr>
             </w:pPr>
+            <w:r>
+              <w:rPr>
+                <w:rFonts w:ascii="Arial" w:hAnsi="Arial" w:cs="Arial"/>
+                <w:lang w:val="pt-BR"/>
+              </w:rPr>
+              <w:t>X</w:t>
+            </w:r>
           </w:p>
         </w:tc>
       </w:tr>
@@ -7905,7 +7592,6 @@
                 <w:rFonts w:ascii="Arial" w:hAnsi="Arial" w:cs="Arial"/>
               </w:rPr>
             </w:pPr>
-            <w:proofErr w:type="spellStart"/>
             <w:r>
               <w:rPr>
                 <w:rFonts w:ascii="Arial" w:hAnsi="Arial" w:cs="Arial"/>
@@ -7913,7 +7599,6 @@
               </w:rPr>
               <w:t>Requisito</w:t>
             </w:r>
-            <w:proofErr w:type="spellEnd"/>
           </w:p>
         </w:tc>
         <w:tc>
@@ -8062,6 +7747,13 @@
                 <w:lang w:val="pt-BR"/>
               </w:rPr>
             </w:pPr>
+            <w:r>
+              <w:rPr>
+                <w:rFonts w:ascii="Arial" w:hAnsi="Arial" w:cs="Arial"/>
+                <w:lang w:val="pt-BR"/>
+              </w:rPr>
+              <w:t>X</w:t>
+            </w:r>
           </w:p>
         </w:tc>
       </w:tr>
@@ -8253,6 +7945,13 @@
                 <w:lang w:val="pt-BR"/>
               </w:rPr>
             </w:pPr>
+            <w:r>
+              <w:rPr>
+                <w:rFonts w:ascii="Arial" w:hAnsi="Arial" w:cs="Arial"/>
+                <w:lang w:val="pt-BR"/>
+              </w:rPr>
+              <w:t>X</w:t>
+            </w:r>
           </w:p>
         </w:tc>
       </w:tr>
@@ -8338,6 +8037,13 @@
                 <w:lang w:val="pt-BR"/>
               </w:rPr>
             </w:pPr>
+            <w:r>
+              <w:rPr>
+                <w:rFonts w:ascii="Arial" w:hAnsi="Arial" w:cs="Arial"/>
+                <w:lang w:val="pt-BR"/>
+              </w:rPr>
+              <w:t>X</w:t>
+            </w:r>
           </w:p>
         </w:tc>
       </w:tr>
@@ -8448,33 +8154,8 @@
           <w:rFonts w:ascii="Arial" w:hAnsi="Arial" w:cs="Arial"/>
           <w:color w:val="000000" w:themeColor="text1"/>
         </w:rPr>
-        <w:t xml:space="preserve">3.10 </w:t>
+        <w:t>3.10 Conclusão do chamado</w:t>
       </w:r>
-      <w:proofErr w:type="spellStart"/>
-      <w:r>
-        <w:rPr>
-          <w:rFonts w:ascii="Arial" w:hAnsi="Arial" w:cs="Arial"/>
-          <w:color w:val="000000" w:themeColor="text1"/>
-        </w:rPr>
-        <w:t>Conclusão</w:t>
-      </w:r>
-      <w:proofErr w:type="spellEnd"/>
-      <w:r>
-        <w:rPr>
-          <w:rFonts w:ascii="Arial" w:hAnsi="Arial" w:cs="Arial"/>
-          <w:color w:val="000000" w:themeColor="text1"/>
-        </w:rPr>
-        <w:t xml:space="preserve"> do </w:t>
-      </w:r>
-      <w:proofErr w:type="spellStart"/>
-      <w:r>
-        <w:rPr>
-          <w:rFonts w:ascii="Arial" w:hAnsi="Arial" w:cs="Arial"/>
-          <w:color w:val="000000" w:themeColor="text1"/>
-        </w:rPr>
-        <w:t>chamado</w:t>
-      </w:r>
-      <w:proofErr w:type="spellEnd"/>
     </w:p>
     <w:tbl>
       <w:tblPr>
@@ -8536,7 +8217,6 @@
                 <w:rFonts w:ascii="Arial" w:hAnsi="Arial" w:cs="Arial"/>
               </w:rPr>
             </w:pPr>
-            <w:proofErr w:type="spellStart"/>
             <w:r>
               <w:rPr>
                 <w:rFonts w:ascii="Arial" w:hAnsi="Arial" w:cs="Arial"/>
@@ -8544,7 +8224,6 @@
               </w:rPr>
               <w:t>Requisito</w:t>
             </w:r>
-            <w:proofErr w:type="spellEnd"/>
           </w:p>
         </w:tc>
         <w:tc>
@@ -8997,6 +8676,13 @@
                 <w:lang w:val="pt-BR"/>
               </w:rPr>
             </w:pPr>
+            <w:r>
+              <w:rPr>
+                <w:rFonts w:ascii="Arial" w:hAnsi="Arial" w:cs="Arial"/>
+                <w:lang w:val="pt-BR"/>
+              </w:rPr>
+              <w:t>X</w:t>
+            </w:r>
           </w:p>
         </w:tc>
       </w:tr>
@@ -9022,17 +8708,8 @@
           <w:rFonts w:ascii="Arial" w:hAnsi="Arial" w:cs="Arial"/>
           <w:color w:val="000000" w:themeColor="text1"/>
         </w:rPr>
-        <w:t xml:space="preserve">3.11 </w:t>
+        <w:t>3.11 Notificações</w:t>
       </w:r>
-      <w:proofErr w:type="spellStart"/>
-      <w:r>
-        <w:rPr>
-          <w:rFonts w:ascii="Arial" w:hAnsi="Arial" w:cs="Arial"/>
-          <w:color w:val="000000" w:themeColor="text1"/>
-        </w:rPr>
-        <w:t>Notificações</w:t>
-      </w:r>
-      <w:proofErr w:type="spellEnd"/>
     </w:p>
     <w:tbl>
       <w:tblPr>
@@ -9094,7 +8771,6 @@
                 <w:rFonts w:ascii="Arial" w:hAnsi="Arial" w:cs="Arial"/>
               </w:rPr>
             </w:pPr>
-            <w:proofErr w:type="spellStart"/>
             <w:r>
               <w:rPr>
                 <w:rFonts w:ascii="Arial" w:hAnsi="Arial" w:cs="Arial"/>
@@ -9102,7 +8778,6 @@
               </w:rPr>
               <w:t>Requisito</w:t>
             </w:r>
-            <w:proofErr w:type="spellEnd"/>
           </w:p>
         </w:tc>
         <w:tc>
@@ -9581,33 +9256,8 @@
           <w:rFonts w:ascii="Arial" w:hAnsi="Arial" w:cs="Arial"/>
           <w:color w:val="000000" w:themeColor="text1"/>
         </w:rPr>
-        <w:t xml:space="preserve">3.12 Dados do </w:t>
+        <w:t>3.12 Dados do usuário — Cidadão</w:t>
       </w:r>
-      <w:proofErr w:type="spellStart"/>
-      <w:r>
-        <w:rPr>
-          <w:rFonts w:ascii="Arial" w:hAnsi="Arial" w:cs="Arial"/>
-          <w:color w:val="000000" w:themeColor="text1"/>
-        </w:rPr>
-        <w:t>usuário</w:t>
-      </w:r>
-      <w:proofErr w:type="spellEnd"/>
-      <w:r>
-        <w:rPr>
-          <w:rFonts w:ascii="Arial" w:hAnsi="Arial" w:cs="Arial"/>
-          <w:color w:val="000000" w:themeColor="text1"/>
-        </w:rPr>
-        <w:t xml:space="preserve"> — </w:t>
-      </w:r>
-      <w:proofErr w:type="spellStart"/>
-      <w:r>
-        <w:rPr>
-          <w:rFonts w:ascii="Arial" w:hAnsi="Arial" w:cs="Arial"/>
-          <w:color w:val="000000" w:themeColor="text1"/>
-        </w:rPr>
-        <w:t>Cidadão</w:t>
-      </w:r>
-      <w:proofErr w:type="spellEnd"/>
     </w:p>
     <w:tbl>
       <w:tblPr>
@@ -9669,7 +9319,6 @@
                 <w:rFonts w:ascii="Arial" w:hAnsi="Arial" w:cs="Arial"/>
               </w:rPr>
             </w:pPr>
-            <w:proofErr w:type="spellStart"/>
             <w:r>
               <w:rPr>
                 <w:rFonts w:ascii="Arial" w:hAnsi="Arial" w:cs="Arial"/>
@@ -9677,7 +9326,6 @@
               </w:rPr>
               <w:t>Requisito</w:t>
             </w:r>
-            <w:proofErr w:type="spellEnd"/>
           </w:p>
         </w:tc>
         <w:tc>
@@ -10121,23 +9769,7 @@
           <w:rFonts w:ascii="Arial" w:hAnsi="Arial" w:cs="Arial"/>
           <w:color w:val="000000" w:themeColor="text1"/>
         </w:rPr>
-        <w:t xml:space="preserve">3.13 Dados do </w:t>
-      </w:r>
-      <w:proofErr w:type="spellStart"/>
-      <w:r>
-        <w:rPr>
-          <w:rFonts w:ascii="Arial" w:hAnsi="Arial" w:cs="Arial"/>
-          <w:color w:val="000000" w:themeColor="text1"/>
-        </w:rPr>
-        <w:t>usuário</w:t>
-      </w:r>
-      <w:proofErr w:type="spellEnd"/>
-      <w:r>
-        <w:rPr>
-          <w:rFonts w:ascii="Arial" w:hAnsi="Arial" w:cs="Arial"/>
-          <w:color w:val="000000" w:themeColor="text1"/>
-        </w:rPr>
-        <w:t xml:space="preserve"> — Técnico</w:t>
+        <w:t>3.13 Dados do usuário — Técnico</w:t>
       </w:r>
     </w:p>
     <w:tbl>
@@ -10200,7 +9832,6 @@
                 <w:rFonts w:ascii="Arial" w:hAnsi="Arial" w:cs="Arial"/>
               </w:rPr>
             </w:pPr>
-            <w:proofErr w:type="spellStart"/>
             <w:r>
               <w:rPr>
                 <w:rFonts w:ascii="Arial" w:hAnsi="Arial" w:cs="Arial"/>
@@ -10208,7 +9839,6 @@
               </w:rPr>
               <w:t>Requisito</w:t>
             </w:r>
-            <w:proofErr w:type="spellEnd"/>
           </w:p>
         </w:tc>
         <w:tc>
@@ -10674,17 +10304,8 @@
           <w:rFonts w:ascii="Arial" w:hAnsi="Arial" w:cs="Arial"/>
           <w:color w:val="000000" w:themeColor="text1"/>
         </w:rPr>
-        <w:t xml:space="preserve">3.14 Manual e </w:t>
+        <w:t>3.14 Manual e ajuda</w:t>
       </w:r>
-      <w:proofErr w:type="spellStart"/>
-      <w:r>
-        <w:rPr>
-          <w:rFonts w:ascii="Arial" w:hAnsi="Arial" w:cs="Arial"/>
-          <w:color w:val="000000" w:themeColor="text1"/>
-        </w:rPr>
-        <w:t>ajuda</w:t>
-      </w:r>
-      <w:proofErr w:type="spellEnd"/>
     </w:p>
     <w:tbl>
       <w:tblPr>
@@ -10746,7 +10367,6 @@
                 <w:rFonts w:ascii="Arial" w:hAnsi="Arial" w:cs="Arial"/>
               </w:rPr>
             </w:pPr>
-            <w:proofErr w:type="spellStart"/>
             <w:r>
               <w:rPr>
                 <w:rFonts w:ascii="Arial" w:hAnsi="Arial" w:cs="Arial"/>
@@ -10754,7 +10374,6 @@
               </w:rPr>
               <w:t>Requisito</w:t>
             </w:r>
-            <w:proofErr w:type="spellEnd"/>
           </w:p>
         </w:tc>
         <w:tc>
@@ -11156,7 +10775,6 @@
                 <w:rFonts w:ascii="Arial" w:hAnsi="Arial" w:cs="Arial"/>
               </w:rPr>
             </w:pPr>
-            <w:proofErr w:type="spellStart"/>
             <w:r>
               <w:rPr>
                 <w:rFonts w:ascii="Arial" w:hAnsi="Arial" w:cs="Arial"/>
@@ -11164,7 +10782,6 @@
               </w:rPr>
               <w:t>Requisito</w:t>
             </w:r>
-            <w:proofErr w:type="spellEnd"/>
           </w:p>
         </w:tc>
         <w:tc>
@@ -11744,7 +11361,6 @@
                 <w:rFonts w:ascii="Arial" w:hAnsi="Arial" w:cs="Arial"/>
               </w:rPr>
             </w:pPr>
-            <w:proofErr w:type="spellStart"/>
             <w:r>
               <w:rPr>
                 <w:rFonts w:ascii="Arial" w:hAnsi="Arial" w:cs="Arial"/>
@@ -11752,7 +11368,6 @@
               </w:rPr>
               <w:t>Requisito</w:t>
             </w:r>
-            <w:proofErr w:type="spellEnd"/>
           </w:p>
         </w:tc>
         <w:tc>
@@ -12649,33 +12264,8 @@
           <w:rFonts w:ascii="Arial" w:hAnsi="Arial" w:cs="Arial"/>
           <w:color w:val="000000" w:themeColor="text1"/>
         </w:rPr>
-        <w:t xml:space="preserve">3.17 </w:t>
+        <w:t>3.17 Histórico do chamado</w:t>
       </w:r>
-      <w:proofErr w:type="spellStart"/>
-      <w:r>
-        <w:rPr>
-          <w:rFonts w:ascii="Arial" w:hAnsi="Arial" w:cs="Arial"/>
-          <w:color w:val="000000" w:themeColor="text1"/>
-        </w:rPr>
-        <w:t>Histórico</w:t>
-      </w:r>
-      <w:proofErr w:type="spellEnd"/>
-      <w:r>
-        <w:rPr>
-          <w:rFonts w:ascii="Arial" w:hAnsi="Arial" w:cs="Arial"/>
-          <w:color w:val="000000" w:themeColor="text1"/>
-        </w:rPr>
-        <w:t xml:space="preserve"> do </w:t>
-      </w:r>
-      <w:proofErr w:type="spellStart"/>
-      <w:r>
-        <w:rPr>
-          <w:rFonts w:ascii="Arial" w:hAnsi="Arial" w:cs="Arial"/>
-          <w:color w:val="000000" w:themeColor="text1"/>
-        </w:rPr>
-        <w:t>chamado</w:t>
-      </w:r>
-      <w:proofErr w:type="spellEnd"/>
     </w:p>
     <w:tbl>
       <w:tblPr>
@@ -12737,7 +12327,6 @@
                 <w:rFonts w:ascii="Arial" w:hAnsi="Arial" w:cs="Arial"/>
               </w:rPr>
             </w:pPr>
-            <w:proofErr w:type="spellStart"/>
             <w:r>
               <w:rPr>
                 <w:rFonts w:ascii="Arial" w:hAnsi="Arial" w:cs="Arial"/>
@@ -12745,7 +12334,6 @@
               </w:rPr>
               <w:t>Requisito</w:t>
             </w:r>
-            <w:proofErr w:type="spellEnd"/>
           </w:p>
         </w:tc>
         <w:tc>
@@ -13483,7 +13071,6 @@
                 <w:rFonts w:ascii="Arial" w:hAnsi="Arial" w:cs="Arial"/>
               </w:rPr>
             </w:pPr>
-            <w:proofErr w:type="spellStart"/>
             <w:r>
               <w:rPr>
                 <w:rFonts w:ascii="Arial" w:hAnsi="Arial" w:cs="Arial"/>
@@ -13491,7 +13078,6 @@
               </w:rPr>
               <w:t>Requisito</w:t>
             </w:r>
-            <w:proofErr w:type="spellEnd"/>
           </w:p>
         </w:tc>
         <w:tc>
@@ -14255,7 +13841,6 @@
                 <w:rFonts w:ascii="Arial" w:hAnsi="Arial" w:cs="Arial"/>
               </w:rPr>
             </w:pPr>
-            <w:proofErr w:type="spellStart"/>
             <w:r>
               <w:rPr>
                 <w:rFonts w:ascii="Arial" w:hAnsi="Arial" w:cs="Arial"/>
@@ -14263,7 +13848,6 @@
               </w:rPr>
               <w:t>Requisito</w:t>
             </w:r>
-            <w:proofErr w:type="spellEnd"/>
           </w:p>
         </w:tc>
         <w:tc>
@@ -14635,33 +14219,8 @@
           <w:rFonts w:ascii="Arial" w:hAnsi="Arial" w:cs="Arial"/>
           <w:color w:val="000000" w:themeColor="text1"/>
         </w:rPr>
-        <w:t xml:space="preserve">3.20 </w:t>
+        <w:t>3.20 Pessoas/Cidadãos</w:t>
       </w:r>
-      <w:proofErr w:type="spellStart"/>
-      <w:r>
-        <w:rPr>
-          <w:rFonts w:ascii="Arial" w:hAnsi="Arial" w:cs="Arial"/>
-          <w:color w:val="000000" w:themeColor="text1"/>
-        </w:rPr>
-        <w:t>Pessoas</w:t>
-      </w:r>
-      <w:proofErr w:type="spellEnd"/>
-      <w:r>
-        <w:rPr>
-          <w:rFonts w:ascii="Arial" w:hAnsi="Arial" w:cs="Arial"/>
-          <w:color w:val="000000" w:themeColor="text1"/>
-        </w:rPr>
-        <w:t>/</w:t>
-      </w:r>
-      <w:proofErr w:type="spellStart"/>
-      <w:r>
-        <w:rPr>
-          <w:rFonts w:ascii="Arial" w:hAnsi="Arial" w:cs="Arial"/>
-          <w:color w:val="000000" w:themeColor="text1"/>
-        </w:rPr>
-        <w:t>Cidadãos</w:t>
-      </w:r>
-      <w:proofErr w:type="spellEnd"/>
     </w:p>
     <w:tbl>
       <w:tblPr>
@@ -14723,7 +14282,6 @@
                 <w:rFonts w:ascii="Arial" w:hAnsi="Arial" w:cs="Arial"/>
               </w:rPr>
             </w:pPr>
-            <w:proofErr w:type="spellStart"/>
             <w:r>
               <w:rPr>
                 <w:rFonts w:ascii="Arial" w:hAnsi="Arial" w:cs="Arial"/>
@@ -14731,7 +14289,6 @@
               </w:rPr>
               <w:t>Requisito</w:t>
             </w:r>
-            <w:proofErr w:type="spellEnd"/>
           </w:p>
         </w:tc>
         <w:tc>
@@ -15431,17 +14988,8 @@
           <w:rFonts w:ascii="Arial" w:hAnsi="Arial" w:cs="Arial"/>
           <w:color w:val="000000" w:themeColor="text1"/>
         </w:rPr>
-        <w:t xml:space="preserve">3.21 </w:t>
+        <w:t>3.21 Técnicos</w:t>
       </w:r>
-      <w:proofErr w:type="spellStart"/>
-      <w:r>
-        <w:rPr>
-          <w:rFonts w:ascii="Arial" w:hAnsi="Arial" w:cs="Arial"/>
-          <w:color w:val="000000" w:themeColor="text1"/>
-        </w:rPr>
-        <w:t>Técnicos</w:t>
-      </w:r>
-      <w:proofErr w:type="spellEnd"/>
     </w:p>
     <w:tbl>
       <w:tblPr>
@@ -15503,7 +15051,6 @@
                 <w:rFonts w:ascii="Arial" w:hAnsi="Arial" w:cs="Arial"/>
               </w:rPr>
             </w:pPr>
-            <w:proofErr w:type="spellStart"/>
             <w:r>
               <w:rPr>
                 <w:rFonts w:ascii="Arial" w:hAnsi="Arial" w:cs="Arial"/>
@@ -15511,7 +15058,6 @@
               </w:rPr>
               <w:t>Requisito</w:t>
             </w:r>
-            <w:proofErr w:type="spellEnd"/>
           </w:p>
         </w:tc>
         <w:tc>
@@ -16578,17 +16124,8 @@
           <w:color w:val="000000" w:themeColor="text1"/>
         </w:rPr>
         <w:lastRenderedPageBreak/>
-        <w:t xml:space="preserve">3.22 </w:t>
+        <w:t>3.22 Gestores</w:t>
       </w:r>
-      <w:proofErr w:type="spellStart"/>
-      <w:r>
-        <w:rPr>
-          <w:rFonts w:ascii="Arial" w:hAnsi="Arial" w:cs="Arial"/>
-          <w:color w:val="000000" w:themeColor="text1"/>
-        </w:rPr>
-        <w:t>Gestores</w:t>
-      </w:r>
-      <w:proofErr w:type="spellEnd"/>
     </w:p>
     <w:tbl>
       <w:tblPr>
@@ -16650,7 +16187,6 @@
                 <w:rFonts w:ascii="Arial" w:hAnsi="Arial" w:cs="Arial"/>
               </w:rPr>
             </w:pPr>
-            <w:proofErr w:type="spellStart"/>
             <w:r>
               <w:rPr>
                 <w:rFonts w:ascii="Arial" w:hAnsi="Arial" w:cs="Arial"/>
@@ -16658,7 +16194,6 @@
               </w:rPr>
               <w:t>Requisito</w:t>
             </w:r>
-            <w:proofErr w:type="spellEnd"/>
           </w:p>
         </w:tc>
         <w:tc>
@@ -17660,17 +17195,8 @@
           <w:rFonts w:ascii="Arial" w:hAnsi="Arial" w:cs="Arial"/>
           <w:color w:val="000000" w:themeColor="text1"/>
         </w:rPr>
-        <w:t xml:space="preserve">3.23 </w:t>
+        <w:t>3.23 Departamentos</w:t>
       </w:r>
-      <w:proofErr w:type="spellStart"/>
-      <w:r>
-        <w:rPr>
-          <w:rFonts w:ascii="Arial" w:hAnsi="Arial" w:cs="Arial"/>
-          <w:color w:val="000000" w:themeColor="text1"/>
-        </w:rPr>
-        <w:t>Departamentos</w:t>
-      </w:r>
-      <w:proofErr w:type="spellEnd"/>
     </w:p>
     <w:tbl>
       <w:tblPr>
@@ -17732,7 +17258,6 @@
                 <w:rFonts w:ascii="Arial" w:hAnsi="Arial" w:cs="Arial"/>
               </w:rPr>
             </w:pPr>
-            <w:proofErr w:type="spellStart"/>
             <w:r>
               <w:rPr>
                 <w:rFonts w:ascii="Arial" w:hAnsi="Arial" w:cs="Arial"/>
@@ -17740,7 +17265,6 @@
               </w:rPr>
               <w:t>Requisito</w:t>
             </w:r>
-            <w:proofErr w:type="spellEnd"/>
           </w:p>
         </w:tc>
         <w:tc>
@@ -18255,33 +17779,8 @@
           <w:rFonts w:ascii="Arial" w:hAnsi="Arial" w:cs="Arial"/>
           <w:color w:val="000000" w:themeColor="text1"/>
         </w:rPr>
-        <w:t xml:space="preserve">3.24 </w:t>
+        <w:t>3.24 Administrador Geral</w:t>
       </w:r>
-      <w:proofErr w:type="spellStart"/>
-      <w:r>
-        <w:rPr>
-          <w:rFonts w:ascii="Arial" w:hAnsi="Arial" w:cs="Arial"/>
-          <w:color w:val="000000" w:themeColor="text1"/>
-        </w:rPr>
-        <w:t>Administrador</w:t>
-      </w:r>
-      <w:proofErr w:type="spellEnd"/>
-      <w:r>
-        <w:rPr>
-          <w:rFonts w:ascii="Arial" w:hAnsi="Arial" w:cs="Arial"/>
-          <w:color w:val="000000" w:themeColor="text1"/>
-        </w:rPr>
-        <w:t xml:space="preserve"> </w:t>
-      </w:r>
-      <w:proofErr w:type="spellStart"/>
-      <w:r>
-        <w:rPr>
-          <w:rFonts w:ascii="Arial" w:hAnsi="Arial" w:cs="Arial"/>
-          <w:color w:val="000000" w:themeColor="text1"/>
-        </w:rPr>
-        <w:t>Geral</w:t>
-      </w:r>
-      <w:proofErr w:type="spellEnd"/>
     </w:p>
     <w:tbl>
       <w:tblPr>
@@ -18343,7 +17842,6 @@
                 <w:rFonts w:ascii="Arial" w:hAnsi="Arial" w:cs="Arial"/>
               </w:rPr>
             </w:pPr>
-            <w:proofErr w:type="spellStart"/>
             <w:r>
               <w:rPr>
                 <w:rFonts w:ascii="Arial" w:hAnsi="Arial" w:cs="Arial"/>
@@ -18351,7 +17849,6 @@
               </w:rPr>
               <w:t>Requisito</w:t>
             </w:r>
-            <w:proofErr w:type="spellEnd"/>
           </w:p>
         </w:tc>
         <w:tc>
@@ -18858,33 +18355,8 @@
           <w:rFonts w:ascii="Arial" w:hAnsi="Arial" w:cs="Arial"/>
           <w:color w:val="000000" w:themeColor="text1"/>
         </w:rPr>
-        <w:t xml:space="preserve">3.25 </w:t>
+        <w:t>3.25 Geração de usuários</w:t>
       </w:r>
-      <w:proofErr w:type="spellStart"/>
-      <w:r>
-        <w:rPr>
-          <w:rFonts w:ascii="Arial" w:hAnsi="Arial" w:cs="Arial"/>
-          <w:color w:val="000000" w:themeColor="text1"/>
-        </w:rPr>
-        <w:t>Geração</w:t>
-      </w:r>
-      <w:proofErr w:type="spellEnd"/>
-      <w:r>
-        <w:rPr>
-          <w:rFonts w:ascii="Arial" w:hAnsi="Arial" w:cs="Arial"/>
-          <w:color w:val="000000" w:themeColor="text1"/>
-        </w:rPr>
-        <w:t xml:space="preserve"> de </w:t>
-      </w:r>
-      <w:proofErr w:type="spellStart"/>
-      <w:r>
-        <w:rPr>
-          <w:rFonts w:ascii="Arial" w:hAnsi="Arial" w:cs="Arial"/>
-          <w:color w:val="000000" w:themeColor="text1"/>
-        </w:rPr>
-        <w:t>usuários</w:t>
-      </w:r>
-      <w:proofErr w:type="spellEnd"/>
     </w:p>
     <w:tbl>
       <w:tblPr>
@@ -18946,7 +18418,6 @@
                 <w:rFonts w:ascii="Arial" w:hAnsi="Arial" w:cs="Arial"/>
               </w:rPr>
             </w:pPr>
-            <w:proofErr w:type="spellStart"/>
             <w:r>
               <w:rPr>
                 <w:rFonts w:ascii="Arial" w:hAnsi="Arial" w:cs="Arial"/>
@@ -18954,7 +18425,6 @@
               </w:rPr>
               <w:t>Requisito</w:t>
             </w:r>
-            <w:proofErr w:type="spellEnd"/>
           </w:p>
         </w:tc>
         <w:tc>
@@ -19992,49 +19462,8 @@
           <w:rFonts w:ascii="Arial" w:hAnsi="Arial" w:cs="Arial"/>
           <w:color w:val="000000" w:themeColor="text1"/>
         </w:rPr>
-        <w:t xml:space="preserve">3.26 </w:t>
+        <w:t>3.26 Mensageria e processamento assíncrono</w:t>
       </w:r>
-      <w:proofErr w:type="spellStart"/>
-      <w:r>
-        <w:rPr>
-          <w:rFonts w:ascii="Arial" w:hAnsi="Arial" w:cs="Arial"/>
-          <w:color w:val="000000" w:themeColor="text1"/>
-        </w:rPr>
-        <w:t>Mensageria</w:t>
-      </w:r>
-      <w:proofErr w:type="spellEnd"/>
-      <w:r>
-        <w:rPr>
-          <w:rFonts w:ascii="Arial" w:hAnsi="Arial" w:cs="Arial"/>
-          <w:color w:val="000000" w:themeColor="text1"/>
-        </w:rPr>
-        <w:t xml:space="preserve"> e </w:t>
-      </w:r>
-      <w:proofErr w:type="spellStart"/>
-      <w:r>
-        <w:rPr>
-          <w:rFonts w:ascii="Arial" w:hAnsi="Arial" w:cs="Arial"/>
-          <w:color w:val="000000" w:themeColor="text1"/>
-        </w:rPr>
-        <w:t>processamento</w:t>
-      </w:r>
-      <w:proofErr w:type="spellEnd"/>
-      <w:r>
-        <w:rPr>
-          <w:rFonts w:ascii="Arial" w:hAnsi="Arial" w:cs="Arial"/>
-          <w:color w:val="000000" w:themeColor="text1"/>
-        </w:rPr>
-        <w:t xml:space="preserve"> </w:t>
-      </w:r>
-      <w:proofErr w:type="spellStart"/>
-      <w:r>
-        <w:rPr>
-          <w:rFonts w:ascii="Arial" w:hAnsi="Arial" w:cs="Arial"/>
-          <w:color w:val="000000" w:themeColor="text1"/>
-        </w:rPr>
-        <w:t>assíncrono</w:t>
-      </w:r>
-      <w:proofErr w:type="spellEnd"/>
     </w:p>
     <w:tbl>
       <w:tblPr>
@@ -20096,7 +19525,6 @@
                 <w:rFonts w:ascii="Arial" w:hAnsi="Arial" w:cs="Arial"/>
               </w:rPr>
             </w:pPr>
-            <w:proofErr w:type="spellStart"/>
             <w:r>
               <w:rPr>
                 <w:rFonts w:ascii="Arial" w:hAnsi="Arial" w:cs="Arial"/>
@@ -20104,7 +19532,6 @@
               </w:rPr>
               <w:t>Requisito</w:t>
             </w:r>
-            <w:proofErr w:type="spellEnd"/>
           </w:p>
         </w:tc>
         <w:tc>
@@ -21210,59 +20637,8 @@
           <w:sz w:val="32"/>
           <w:szCs w:val="32"/>
         </w:rPr>
-        <w:t xml:space="preserve">4. </w:t>
+        <w:t>4. Requisitos não funcionais</w:t>
       </w:r>
-      <w:proofErr w:type="spellStart"/>
-      <w:r>
-        <w:rPr>
-          <w:rFonts w:ascii="Arial" w:hAnsi="Arial" w:cs="Arial"/>
-          <w:color w:val="000000" w:themeColor="text1"/>
-          <w:sz w:val="32"/>
-          <w:szCs w:val="32"/>
-        </w:rPr>
-        <w:t>Requisitos</w:t>
-      </w:r>
-      <w:proofErr w:type="spellEnd"/>
-      <w:r>
-        <w:rPr>
-          <w:rFonts w:ascii="Arial" w:hAnsi="Arial" w:cs="Arial"/>
-          <w:color w:val="000000" w:themeColor="text1"/>
-          <w:sz w:val="32"/>
-          <w:szCs w:val="32"/>
-        </w:rPr>
-        <w:t xml:space="preserve"> </w:t>
-      </w:r>
-      <w:proofErr w:type="spellStart"/>
-      <w:r>
-        <w:rPr>
-          <w:rFonts w:ascii="Arial" w:hAnsi="Arial" w:cs="Arial"/>
-          <w:color w:val="000000" w:themeColor="text1"/>
-          <w:sz w:val="32"/>
-          <w:szCs w:val="32"/>
-        </w:rPr>
-        <w:t>não</w:t>
-      </w:r>
-      <w:proofErr w:type="spellEnd"/>
-      <w:r>
-        <w:rPr>
-          <w:rFonts w:ascii="Arial" w:hAnsi="Arial" w:cs="Arial"/>
-          <w:color w:val="000000" w:themeColor="text1"/>
-          <w:sz w:val="32"/>
-          <w:szCs w:val="32"/>
-        </w:rPr>
-        <w:t xml:space="preserve"> </w:t>
-      </w:r>
-      <w:proofErr w:type="spellStart"/>
-      <w:r>
-        <w:rPr>
-          <w:rFonts w:ascii="Arial" w:hAnsi="Arial" w:cs="Arial"/>
-          <w:color w:val="000000" w:themeColor="text1"/>
-          <w:sz w:val="32"/>
-          <w:szCs w:val="32"/>
-        </w:rPr>
-        <w:t>funcionais</w:t>
-      </w:r>
-      <w:proofErr w:type="spellEnd"/>
     </w:p>
     <w:p>
       <w:pPr>
@@ -21284,17 +20660,8 @@
           <w:rFonts w:ascii="Arial" w:hAnsi="Arial" w:cs="Arial"/>
           <w:color w:val="000000" w:themeColor="text1"/>
         </w:rPr>
-        <w:t xml:space="preserve">4.1 </w:t>
+        <w:t>4.1 Desempenho</w:t>
       </w:r>
-      <w:proofErr w:type="spellStart"/>
-      <w:r>
-        <w:rPr>
-          <w:rFonts w:ascii="Arial" w:hAnsi="Arial" w:cs="Arial"/>
-          <w:color w:val="000000" w:themeColor="text1"/>
-        </w:rPr>
-        <w:t>Desempenho</w:t>
-      </w:r>
-      <w:proofErr w:type="spellEnd"/>
     </w:p>
     <w:tbl>
       <w:tblPr>
@@ -21356,7 +20723,6 @@
                 <w:rFonts w:ascii="Arial" w:hAnsi="Arial" w:cs="Arial"/>
               </w:rPr>
             </w:pPr>
-            <w:proofErr w:type="spellStart"/>
             <w:r>
               <w:rPr>
                 <w:rFonts w:ascii="Arial" w:hAnsi="Arial" w:cs="Arial"/>
@@ -21364,7 +20730,6 @@
               </w:rPr>
               <w:t>Requisito</w:t>
             </w:r>
-            <w:proofErr w:type="spellEnd"/>
           </w:p>
         </w:tc>
         <w:tc>
@@ -21909,17 +21274,8 @@
           <w:rFonts w:ascii="Arial" w:hAnsi="Arial" w:cs="Arial"/>
           <w:color w:val="000000" w:themeColor="text1"/>
         </w:rPr>
-        <w:t xml:space="preserve">4.2 </w:t>
+        <w:t>4.2 Disponibilidade</w:t>
       </w:r>
-      <w:proofErr w:type="spellStart"/>
-      <w:r>
-        <w:rPr>
-          <w:rFonts w:ascii="Arial" w:hAnsi="Arial" w:cs="Arial"/>
-          <w:color w:val="000000" w:themeColor="text1"/>
-        </w:rPr>
-        <w:t>Disponibilidade</w:t>
-      </w:r>
-      <w:proofErr w:type="spellEnd"/>
     </w:p>
     <w:tbl>
       <w:tblPr>
@@ -21981,7 +21337,6 @@
                 <w:rFonts w:ascii="Arial" w:hAnsi="Arial" w:cs="Arial"/>
               </w:rPr>
             </w:pPr>
-            <w:proofErr w:type="spellStart"/>
             <w:r>
               <w:rPr>
                 <w:rFonts w:ascii="Arial" w:hAnsi="Arial" w:cs="Arial"/>
@@ -21989,7 +21344,6 @@
               </w:rPr>
               <w:t>Requisito</w:t>
             </w:r>
-            <w:proofErr w:type="spellEnd"/>
           </w:p>
         </w:tc>
         <w:tc>
@@ -22474,17 +21828,8 @@
           <w:rFonts w:ascii="Arial" w:hAnsi="Arial" w:cs="Arial"/>
           <w:color w:val="000000" w:themeColor="text1"/>
         </w:rPr>
-        <w:t xml:space="preserve">4.3 Auditoria e </w:t>
+        <w:t>4.3 Auditoria e rastreabilidade</w:t>
       </w:r>
-      <w:proofErr w:type="spellStart"/>
-      <w:r>
-        <w:rPr>
-          <w:rFonts w:ascii="Arial" w:hAnsi="Arial" w:cs="Arial"/>
-          <w:color w:val="000000" w:themeColor="text1"/>
-        </w:rPr>
-        <w:t>rastreabilidade</w:t>
-      </w:r>
-      <w:proofErr w:type="spellEnd"/>
     </w:p>
     <w:tbl>
       <w:tblPr>
@@ -22546,7 +21891,6 @@
                 <w:rFonts w:ascii="Arial" w:hAnsi="Arial" w:cs="Arial"/>
               </w:rPr>
             </w:pPr>
-            <w:proofErr w:type="spellStart"/>
             <w:r>
               <w:rPr>
                 <w:rFonts w:ascii="Arial" w:hAnsi="Arial" w:cs="Arial"/>
@@ -22554,7 +21898,6 @@
               </w:rPr>
               <w:t>Requisito</w:t>
             </w:r>
-            <w:proofErr w:type="spellEnd"/>
           </w:p>
         </w:tc>
         <w:tc>
@@ -23384,7 +22727,6 @@
                 <w:rFonts w:ascii="Arial" w:hAnsi="Arial" w:cs="Arial"/>
               </w:rPr>
             </w:pPr>
-            <w:proofErr w:type="spellStart"/>
             <w:r>
               <w:rPr>
                 <w:rFonts w:ascii="Arial" w:hAnsi="Arial" w:cs="Arial"/>
@@ -23392,7 +22734,6 @@
               </w:rPr>
               <w:t>Requisito</w:t>
             </w:r>
-            <w:proofErr w:type="spellEnd"/>
           </w:p>
         </w:tc>
         <w:tc>
@@ -24220,33 +23561,8 @@
           <w:rFonts w:ascii="Arial" w:hAnsi="Arial" w:cs="Arial"/>
           <w:color w:val="000000" w:themeColor="text1"/>
         </w:rPr>
-        <w:t xml:space="preserve">4.5 </w:t>
+        <w:t>4.5 Arquitetura e tecnologias</w:t>
       </w:r>
-      <w:proofErr w:type="spellStart"/>
-      <w:r>
-        <w:rPr>
-          <w:rFonts w:ascii="Arial" w:hAnsi="Arial" w:cs="Arial"/>
-          <w:color w:val="000000" w:themeColor="text1"/>
-        </w:rPr>
-        <w:t>Arquitetura</w:t>
-      </w:r>
-      <w:proofErr w:type="spellEnd"/>
-      <w:r>
-        <w:rPr>
-          <w:rFonts w:ascii="Arial" w:hAnsi="Arial" w:cs="Arial"/>
-          <w:color w:val="000000" w:themeColor="text1"/>
-        </w:rPr>
-        <w:t xml:space="preserve"> e </w:t>
-      </w:r>
-      <w:proofErr w:type="spellStart"/>
-      <w:r>
-        <w:rPr>
-          <w:rFonts w:ascii="Arial" w:hAnsi="Arial" w:cs="Arial"/>
-          <w:color w:val="000000" w:themeColor="text1"/>
-        </w:rPr>
-        <w:t>tecnologias</w:t>
-      </w:r>
-      <w:proofErr w:type="spellEnd"/>
     </w:p>
     <w:tbl>
       <w:tblPr>
@@ -24308,7 +23624,6 @@
                 <w:rFonts w:ascii="Arial" w:hAnsi="Arial" w:cs="Arial"/>
               </w:rPr>
             </w:pPr>
-            <w:proofErr w:type="spellStart"/>
             <w:r>
               <w:rPr>
                 <w:rFonts w:ascii="Arial" w:hAnsi="Arial" w:cs="Arial"/>
@@ -24316,7 +23631,6 @@
               </w:rPr>
               <w:t>Requisito</w:t>
             </w:r>
-            <w:proofErr w:type="spellEnd"/>
           </w:p>
         </w:tc>
         <w:tc>
@@ -24401,23 +23715,7 @@
                 <w:rFonts w:ascii="Arial" w:hAnsi="Arial" w:cs="Arial"/>
                 <w:lang w:val="pt-BR"/>
               </w:rPr>
-              <w:t xml:space="preserve">A aplicação Mobile deve ser desenvolvida utilizando </w:t>
-            </w:r>
-            <w:proofErr w:type="spellStart"/>
-            <w:r>
-              <w:rPr>
-                <w:rFonts w:ascii="Arial" w:hAnsi="Arial" w:cs="Arial"/>
-                <w:lang w:val="pt-BR"/>
-              </w:rPr>
-              <w:t>Flutter</w:t>
-            </w:r>
-            <w:proofErr w:type="spellEnd"/>
-            <w:r>
-              <w:rPr>
-                <w:rFonts w:ascii="Arial" w:hAnsi="Arial" w:cs="Arial"/>
-                <w:lang w:val="pt-BR"/>
-              </w:rPr>
-              <w:t>/Dart.</w:t>
+              <w:t>A aplicação Mobile deve ser desenvolvida utilizando Flutter/Dart.</w:t>
             </w:r>
           </w:p>
         </w:tc>
@@ -25098,23 +24396,7 @@
                 <w:rFonts w:ascii="Arial" w:hAnsi="Arial" w:cs="Arial"/>
                 <w:lang w:val="pt-BR"/>
               </w:rPr>
-              <w:t xml:space="preserve">O sistema deve utilizar </w:t>
-            </w:r>
-            <w:proofErr w:type="spellStart"/>
-            <w:r>
-              <w:rPr>
-                <w:rFonts w:ascii="Arial" w:hAnsi="Arial" w:cs="Arial"/>
-                <w:lang w:val="pt-BR"/>
-              </w:rPr>
-              <w:t>RabbitMQ</w:t>
-            </w:r>
-            <w:proofErr w:type="spellEnd"/>
-            <w:r>
-              <w:rPr>
-                <w:rFonts w:ascii="Arial" w:hAnsi="Arial" w:cs="Arial"/>
-                <w:lang w:val="pt-BR"/>
-              </w:rPr>
-              <w:t xml:space="preserve"> como mecanismo de mensageria.</w:t>
+              <w:t>O sistema deve utilizar RabbitMQ como mecanismo de mensageria.</w:t>
             </w:r>
           </w:p>
         </w:tc>
@@ -25162,33 +24444,8 @@
           <w:rFonts w:ascii="Arial" w:hAnsi="Arial" w:cs="Arial"/>
           <w:color w:val="000000" w:themeColor="text1"/>
         </w:rPr>
-        <w:t xml:space="preserve">4.6 </w:t>
+        <w:t>4.6 Usabilidade e acessibilidade</w:t>
       </w:r>
-      <w:proofErr w:type="spellStart"/>
-      <w:r>
-        <w:rPr>
-          <w:rFonts w:ascii="Arial" w:hAnsi="Arial" w:cs="Arial"/>
-          <w:color w:val="000000" w:themeColor="text1"/>
-        </w:rPr>
-        <w:t>Usabilidade</w:t>
-      </w:r>
-      <w:proofErr w:type="spellEnd"/>
-      <w:r>
-        <w:rPr>
-          <w:rFonts w:ascii="Arial" w:hAnsi="Arial" w:cs="Arial"/>
-          <w:color w:val="000000" w:themeColor="text1"/>
-        </w:rPr>
-        <w:t xml:space="preserve"> e </w:t>
-      </w:r>
-      <w:proofErr w:type="spellStart"/>
-      <w:r>
-        <w:rPr>
-          <w:rFonts w:ascii="Arial" w:hAnsi="Arial" w:cs="Arial"/>
-          <w:color w:val="000000" w:themeColor="text1"/>
-        </w:rPr>
-        <w:t>acessibilidade</w:t>
-      </w:r>
-      <w:proofErr w:type="spellEnd"/>
     </w:p>
     <w:tbl>
       <w:tblPr>
@@ -25250,7 +24507,6 @@
                 <w:rFonts w:ascii="Arial" w:hAnsi="Arial" w:cs="Arial"/>
               </w:rPr>
             </w:pPr>
-            <w:proofErr w:type="spellStart"/>
             <w:r>
               <w:rPr>
                 <w:rFonts w:ascii="Arial" w:hAnsi="Arial" w:cs="Arial"/>
@@ -25258,7 +24514,6 @@
               </w:rPr>
               <w:t>Requisito</w:t>
             </w:r>
-            <w:proofErr w:type="spellEnd"/>
           </w:p>
         </w:tc>
         <w:tc>
@@ -25543,6 +24798,7 @@
           <w:color w:val="000000" w:themeColor="text1"/>
           <w:sz w:val="32"/>
           <w:szCs w:val="32"/>
+          <w:lang w:val="pt-BR"/>
         </w:rPr>
       </w:pPr>
     </w:p>
@@ -25563,39 +24819,8 @@
           <w:sz w:val="32"/>
           <w:szCs w:val="32"/>
         </w:rPr>
-        <w:t>5. R</w:t>
+        <w:t>5. Regras de negócio</w:t>
       </w:r>
-      <w:proofErr w:type="spellStart"/>
-      <w:r>
-        <w:rPr>
-          <w:rFonts w:ascii="Arial" w:hAnsi="Arial" w:cs="Arial"/>
-          <w:color w:val="000000" w:themeColor="text1"/>
-          <w:sz w:val="32"/>
-          <w:szCs w:val="32"/>
-        </w:rPr>
-        <w:t>egras</w:t>
-      </w:r>
-      <w:proofErr w:type="spellEnd"/>
-      <w:r>
-        <w:rPr>
-          <w:rFonts w:ascii="Arial" w:hAnsi="Arial" w:cs="Arial"/>
-          <w:color w:val="000000" w:themeColor="text1"/>
-          <w:sz w:val="32"/>
-          <w:szCs w:val="32"/>
-        </w:rPr>
-        <w:t xml:space="preserve"> de </w:t>
-      </w:r>
-      <w:proofErr w:type="spellStart"/>
-      <w:r>
-        <w:rPr>
-          <w:rFonts w:ascii="Arial" w:hAnsi="Arial" w:cs="Arial"/>
-          <w:color w:val="000000" w:themeColor="text1"/>
-          <w:sz w:val="32"/>
-          <w:szCs w:val="32"/>
-        </w:rPr>
-        <w:t>negócio</w:t>
-      </w:r>
-      <w:proofErr w:type="spellEnd"/>
     </w:p>
     <w:p>
       <w:pPr>
@@ -25664,31 +24889,13 @@
                 <w:rFonts w:ascii="Arial" w:hAnsi="Arial" w:cs="Arial"/>
               </w:rPr>
             </w:pPr>
-            <w:proofErr w:type="spellStart"/>
             <w:r>
               <w:rPr>
                 <w:rFonts w:ascii="Arial" w:hAnsi="Arial" w:cs="Arial"/>
                 <w:b/>
               </w:rPr>
-              <w:t>Regra</w:t>
-            </w:r>
-            <w:proofErr w:type="spellEnd"/>
-            <w:r>
-              <w:rPr>
-                <w:rFonts w:ascii="Arial" w:hAnsi="Arial" w:cs="Arial"/>
-                <w:b/>
-              </w:rPr>
-              <w:t xml:space="preserve"> de </w:t>
-            </w:r>
-            <w:proofErr w:type="spellStart"/>
-            <w:r>
-              <w:rPr>
-                <w:rFonts w:ascii="Arial" w:hAnsi="Arial" w:cs="Arial"/>
-                <w:b/>
-              </w:rPr>
-              <w:t>negócio</w:t>
-            </w:r>
-            <w:proofErr w:type="spellEnd"/>
+              <w:t>Regra de negócio</w:t>
+            </w:r>
           </w:p>
         </w:tc>
         <w:tc>
@@ -26719,17 +25926,8 @@
                 <w:rFonts w:ascii="Arial" w:hAnsi="Arial" w:cs="Arial"/>
                 <w:lang w:val="pt-BR"/>
               </w:rPr>
-              <w:t xml:space="preserve">A urgência é determinada pelo modelo de </w:t>
-            </w:r>
-            <w:proofErr w:type="gramStart"/>
-            <w:r>
-              <w:rPr>
-                <w:rFonts w:ascii="Arial" w:hAnsi="Arial" w:cs="Arial"/>
-                <w:lang w:val="pt-BR"/>
-              </w:rPr>
-              <w:t>IA</w:t>
-            </w:r>
-            <w:proofErr w:type="gramEnd"/>
+              <w:t>A urgência é determinada pelo modelo de IA</w:t>
+            </w:r>
             <w:r>
               <w:rPr>
                 <w:rFonts w:ascii="Arial" w:hAnsi="Arial" w:cs="Arial"/>
@@ -28602,31 +27800,65 @@
                 <w:rFonts w:ascii="Arial" w:hAnsi="Arial" w:cs="Arial"/>
               </w:rPr>
             </w:pPr>
-            <w:proofErr w:type="spellStart"/>
             <w:r>
               <w:rPr>
                 <w:rFonts w:ascii="Arial" w:hAnsi="Arial" w:cs="Arial"/>
                 <w:b/>
               </w:rPr>
-              <w:t>Ator</w:t>
-            </w:r>
-            <w:proofErr w:type="spellEnd"/>
+              <w:t>Ator/Componente</w:t>
+            </w:r>
+          </w:p>
+        </w:tc>
+        <w:tc>
+          <w:tcPr>
+            <w:tcW w:w="1728" w:type="dxa"/>
+            <w:tcBorders>
+              <w:top w:val="single" w:sz="4" w:space="0" w:color="000000"/>
+              <w:left w:val="single" w:sz="4" w:space="0" w:color="000000"/>
+              <w:bottom w:val="single" w:sz="4" w:space="0" w:color="000000"/>
+              <w:right w:val="single" w:sz="4" w:space="0" w:color="000000"/>
+            </w:tcBorders>
+            <w:vAlign w:val="center"/>
+          </w:tcPr>
+          <w:p>
+            <w:pPr>
+              <w:rPr>
+                <w:rFonts w:ascii="Arial" w:hAnsi="Arial" w:cs="Arial"/>
+              </w:rPr>
+            </w:pPr>
             <w:r>
               <w:rPr>
                 <w:rFonts w:ascii="Arial" w:hAnsi="Arial" w:cs="Arial"/>
                 <w:b/>
               </w:rPr>
-              <w:t>/</w:t>
-            </w:r>
-            <w:proofErr w:type="spellStart"/>
+              <w:t>Entrada</w:t>
+            </w:r>
+          </w:p>
+        </w:tc>
+        <w:tc>
+          <w:tcPr>
+            <w:tcW w:w="1728" w:type="dxa"/>
+            <w:tcBorders>
+              <w:top w:val="single" w:sz="4" w:space="0" w:color="000000"/>
+              <w:left w:val="single" w:sz="4" w:space="0" w:color="000000"/>
+              <w:bottom w:val="single" w:sz="4" w:space="0" w:color="000000"/>
+              <w:right w:val="single" w:sz="4" w:space="0" w:color="000000"/>
+            </w:tcBorders>
+            <w:vAlign w:val="center"/>
+          </w:tcPr>
+          <w:p>
+            <w:pPr>
+              <w:rPr>
+                <w:rFonts w:ascii="Arial" w:hAnsi="Arial" w:cs="Arial"/>
+              </w:rPr>
+            </w:pPr>
             <w:r>
               <w:rPr>
                 <w:rFonts w:ascii="Arial" w:hAnsi="Arial" w:cs="Arial"/>
                 <w:b/>
               </w:rPr>
-              <w:t>Componente</w:t>
-            </w:r>
-            <w:proofErr w:type="spellEnd"/>
+              <w:t>Processamento</w:t>
+            </w:r>
           </w:p>
         </w:tc>
         <w:tc>
@@ -28651,64 +27883,8 @@
                 <w:rFonts w:ascii="Arial" w:hAnsi="Arial" w:cs="Arial"/>
                 <w:b/>
               </w:rPr>
-              <w:t>Entrada</w:t>
-            </w:r>
-          </w:p>
-        </w:tc>
-        <w:tc>
-          <w:tcPr>
-            <w:tcW w:w="1728" w:type="dxa"/>
-            <w:tcBorders>
-              <w:top w:val="single" w:sz="4" w:space="0" w:color="000000"/>
-              <w:left w:val="single" w:sz="4" w:space="0" w:color="000000"/>
-              <w:bottom w:val="single" w:sz="4" w:space="0" w:color="000000"/>
-              <w:right w:val="single" w:sz="4" w:space="0" w:color="000000"/>
-            </w:tcBorders>
-            <w:vAlign w:val="center"/>
-          </w:tcPr>
-          <w:p>
-            <w:pPr>
-              <w:rPr>
-                <w:rFonts w:ascii="Arial" w:hAnsi="Arial" w:cs="Arial"/>
-              </w:rPr>
-            </w:pPr>
-            <w:proofErr w:type="spellStart"/>
-            <w:r>
-              <w:rPr>
-                <w:rFonts w:ascii="Arial" w:hAnsi="Arial" w:cs="Arial"/>
-                <w:b/>
-              </w:rPr>
-              <w:t>Processamento</w:t>
-            </w:r>
-            <w:proofErr w:type="spellEnd"/>
-          </w:p>
-        </w:tc>
-        <w:tc>
-          <w:tcPr>
-            <w:tcW w:w="1728" w:type="dxa"/>
-            <w:tcBorders>
-              <w:top w:val="single" w:sz="4" w:space="0" w:color="000000"/>
-              <w:left w:val="single" w:sz="4" w:space="0" w:color="000000"/>
-              <w:bottom w:val="single" w:sz="4" w:space="0" w:color="000000"/>
-              <w:right w:val="single" w:sz="4" w:space="0" w:color="000000"/>
-            </w:tcBorders>
-            <w:vAlign w:val="center"/>
-          </w:tcPr>
-          <w:p>
-            <w:pPr>
-              <w:rPr>
-                <w:rFonts w:ascii="Arial" w:hAnsi="Arial" w:cs="Arial"/>
-              </w:rPr>
-            </w:pPr>
-            <w:proofErr w:type="spellStart"/>
-            <w:r>
-              <w:rPr>
-                <w:rFonts w:ascii="Arial" w:hAnsi="Arial" w:cs="Arial"/>
-                <w:b/>
-              </w:rPr>
               <w:t>Resultado</w:t>
             </w:r>
-            <w:proofErr w:type="spellEnd"/>
           </w:p>
         </w:tc>
       </w:tr>
@@ -28759,14 +27935,12 @@
                 <w:rFonts w:ascii="Arial" w:hAnsi="Arial" w:cs="Arial"/>
               </w:rPr>
             </w:pPr>
-            <w:proofErr w:type="spellStart"/>
             <w:r>
               <w:rPr>
                 <w:rFonts w:ascii="Arial" w:hAnsi="Arial" w:cs="Arial"/>
               </w:rPr>
               <w:t>Cidadão</w:t>
             </w:r>
-            <w:proofErr w:type="spellEnd"/>
           </w:p>
         </w:tc>
         <w:tc>
@@ -28813,28 +27987,12 @@
                 <w:rFonts w:ascii="Arial" w:hAnsi="Arial" w:cs="Arial"/>
               </w:rPr>
             </w:pPr>
-            <w:proofErr w:type="spellStart"/>
-            <w:r>
-              <w:rPr>
-                <w:rFonts w:ascii="Arial" w:hAnsi="Arial" w:cs="Arial"/>
-              </w:rPr>
-              <w:t>Cadastro</w:t>
-            </w:r>
-            <w:proofErr w:type="spellEnd"/>
-            <w:r>
-              <w:rPr>
-                <w:rFonts w:ascii="Arial" w:hAnsi="Arial" w:cs="Arial"/>
-              </w:rPr>
-              <w:t xml:space="preserve"> do </w:t>
-            </w:r>
-            <w:proofErr w:type="spellStart"/>
-            <w:r>
-              <w:rPr>
-                <w:rFonts w:ascii="Arial" w:hAnsi="Arial" w:cs="Arial"/>
-              </w:rPr>
-              <w:t>chamado</w:t>
-            </w:r>
-            <w:proofErr w:type="spellEnd"/>
+            <w:r>
+              <w:rPr>
+                <w:rFonts w:ascii="Arial" w:hAnsi="Arial" w:cs="Arial"/>
+              </w:rPr>
+              <w:t>Cadastro do chamado</w:t>
+            </w:r>
           </w:p>
         </w:tc>
         <w:tc>
@@ -28858,16 +28016,8 @@
               <w:rPr>
                 <w:rFonts w:ascii="Arial" w:hAnsi="Arial" w:cs="Arial"/>
               </w:rPr>
-              <w:t xml:space="preserve">Status </w:t>
-            </w:r>
-            <w:proofErr w:type="spellStart"/>
-            <w:r>
-              <w:rPr>
-                <w:rFonts w:ascii="Arial" w:hAnsi="Arial" w:cs="Arial"/>
-              </w:rPr>
-              <w:t>Processamento</w:t>
-            </w:r>
-            <w:proofErr w:type="spellEnd"/>
+              <w:t>Status Processamento</w:t>
+            </w:r>
           </w:p>
         </w:tc>
       </w:tr>
@@ -28946,16 +28096,8 @@
               <w:rPr>
                 <w:rFonts w:ascii="Arial" w:hAnsi="Arial" w:cs="Arial"/>
               </w:rPr>
-              <w:t xml:space="preserve">Dados do </w:t>
-            </w:r>
-            <w:proofErr w:type="spellStart"/>
-            <w:r>
-              <w:rPr>
-                <w:rFonts w:ascii="Arial" w:hAnsi="Arial" w:cs="Arial"/>
-              </w:rPr>
-              <w:t>chamado</w:t>
-            </w:r>
-            <w:proofErr w:type="spellEnd"/>
+              <w:t>Dados do chamado</w:t>
+            </w:r>
           </w:p>
         </w:tc>
         <w:tc>
@@ -29006,30 +28148,8 @@
               <w:rPr>
                 <w:rFonts w:ascii="Arial" w:hAnsi="Arial" w:cs="Arial"/>
               </w:rPr>
-              <w:t>Dados-</w:t>
-            </w:r>
-            <w:proofErr w:type="spellStart"/>
-            <w:r>
-              <w:rPr>
-                <w:rFonts w:ascii="Arial" w:hAnsi="Arial" w:cs="Arial"/>
-              </w:rPr>
-              <w:t>base</w:t>
-            </w:r>
-            <w:proofErr w:type="spellEnd"/>
-            <w:r>
-              <w:rPr>
-                <w:rFonts w:ascii="Arial" w:hAnsi="Arial" w:cs="Arial"/>
-              </w:rPr>
-              <w:t xml:space="preserve"> </w:t>
-            </w:r>
-            <w:proofErr w:type="spellStart"/>
-            <w:r>
-              <w:rPr>
-                <w:rFonts w:ascii="Arial" w:hAnsi="Arial" w:cs="Arial"/>
-              </w:rPr>
-              <w:t>preenchidos</w:t>
-            </w:r>
-            <w:proofErr w:type="spellEnd"/>
+              <w:t>Dados-base preenchidos</w:t>
+            </w:r>
           </w:p>
         </w:tc>
       </w:tr>
@@ -29132,28 +28252,12 @@
                 <w:rFonts w:ascii="Arial" w:hAnsi="Arial" w:cs="Arial"/>
               </w:rPr>
             </w:pPr>
-            <w:proofErr w:type="spellStart"/>
-            <w:r>
-              <w:rPr>
-                <w:rFonts w:ascii="Arial" w:hAnsi="Arial" w:cs="Arial"/>
-              </w:rPr>
-              <w:t>Classificação</w:t>
-            </w:r>
-            <w:proofErr w:type="spellEnd"/>
-            <w:r>
-              <w:rPr>
-                <w:rFonts w:ascii="Arial" w:hAnsi="Arial" w:cs="Arial"/>
-              </w:rPr>
-              <w:t xml:space="preserve"> de </w:t>
-            </w:r>
-            <w:proofErr w:type="spellStart"/>
-            <w:r>
-              <w:rPr>
-                <w:rFonts w:ascii="Arial" w:hAnsi="Arial" w:cs="Arial"/>
-              </w:rPr>
-              <w:t>urgência</w:t>
-            </w:r>
-            <w:proofErr w:type="spellEnd"/>
+            <w:r>
+              <w:rPr>
+                <w:rFonts w:ascii="Arial" w:hAnsi="Arial" w:cs="Arial"/>
+              </w:rPr>
+              <w:t>Classificação de urgência</w:t>
+            </w:r>
           </w:p>
         </w:tc>
         <w:tc>
@@ -29173,19 +28277,11 @@
                 <w:rFonts w:ascii="Arial" w:hAnsi="Arial" w:cs="Arial"/>
               </w:rPr>
             </w:pPr>
-            <w:proofErr w:type="spellStart"/>
-            <w:r>
-              <w:rPr>
-                <w:rFonts w:ascii="Arial" w:hAnsi="Arial" w:cs="Arial"/>
-              </w:rPr>
-              <w:t>Urgência</w:t>
-            </w:r>
-            <w:proofErr w:type="spellEnd"/>
-            <w:r>
-              <w:rPr>
-                <w:rFonts w:ascii="Arial" w:hAnsi="Arial" w:cs="Arial"/>
-              </w:rPr>
-              <w:t xml:space="preserve"> + status Pendente</w:t>
+            <w:r>
+              <w:rPr>
+                <w:rFonts w:ascii="Arial" w:hAnsi="Arial" w:cs="Arial"/>
+              </w:rPr>
+              <w:t>Urgência + status Pendente</w:t>
             </w:r>
           </w:p>
         </w:tc>
@@ -29262,19 +28358,11 @@
                 <w:rFonts w:ascii="Arial" w:hAnsi="Arial" w:cs="Arial"/>
               </w:rPr>
             </w:pPr>
-            <w:proofErr w:type="spellStart"/>
-            <w:r>
-              <w:rPr>
-                <w:rFonts w:ascii="Arial" w:hAnsi="Arial" w:cs="Arial"/>
-              </w:rPr>
-              <w:t>Chamado</w:t>
-            </w:r>
-            <w:proofErr w:type="spellEnd"/>
-            <w:r>
-              <w:rPr>
-                <w:rFonts w:ascii="Arial" w:hAnsi="Arial" w:cs="Arial"/>
-              </w:rPr>
-              <w:t xml:space="preserve"> Pendente</w:t>
+            <w:r>
+              <w:rPr>
+                <w:rFonts w:ascii="Arial" w:hAnsi="Arial" w:cs="Arial"/>
+              </w:rPr>
+              <w:t>Chamado Pendente</w:t>
             </w:r>
           </w:p>
         </w:tc>
@@ -29295,14 +28383,12 @@
                 <w:rFonts w:ascii="Arial" w:hAnsi="Arial" w:cs="Arial"/>
               </w:rPr>
             </w:pPr>
-            <w:proofErr w:type="spellStart"/>
             <w:r>
               <w:rPr>
                 <w:rFonts w:ascii="Arial" w:hAnsi="Arial" w:cs="Arial"/>
               </w:rPr>
               <w:t>Análise</w:t>
             </w:r>
-            <w:proofErr w:type="spellEnd"/>
           </w:p>
         </w:tc>
         <w:tc>
@@ -29326,30 +28412,8 @@
               <w:rPr>
                 <w:rFonts w:ascii="Arial" w:hAnsi="Arial" w:cs="Arial"/>
               </w:rPr>
-              <w:t xml:space="preserve">Pendente / Falta </w:t>
-            </w:r>
-            <w:proofErr w:type="spellStart"/>
-            <w:r>
-              <w:rPr>
-                <w:rFonts w:ascii="Arial" w:hAnsi="Arial" w:cs="Arial"/>
-              </w:rPr>
-              <w:t>Informação</w:t>
-            </w:r>
-            <w:proofErr w:type="spellEnd"/>
-            <w:r>
-              <w:rPr>
-                <w:rFonts w:ascii="Arial" w:hAnsi="Arial" w:cs="Arial"/>
-              </w:rPr>
-              <w:t xml:space="preserve"> / </w:t>
-            </w:r>
-            <w:proofErr w:type="spellStart"/>
-            <w:r>
-              <w:rPr>
-                <w:rFonts w:ascii="Arial" w:hAnsi="Arial" w:cs="Arial"/>
-              </w:rPr>
-              <w:t>Recusado</w:t>
-            </w:r>
-            <w:proofErr w:type="spellEnd"/>
+              <w:t>Pendente / Falta Informação / Recusado</w:t>
+            </w:r>
           </w:p>
         </w:tc>
       </w:tr>
@@ -29425,28 +28489,12 @@
                 <w:rFonts w:ascii="Arial" w:hAnsi="Arial" w:cs="Arial"/>
               </w:rPr>
             </w:pPr>
-            <w:proofErr w:type="spellStart"/>
-            <w:r>
-              <w:rPr>
-                <w:rFonts w:ascii="Arial" w:hAnsi="Arial" w:cs="Arial"/>
-              </w:rPr>
-              <w:t>Chamado</w:t>
-            </w:r>
-            <w:proofErr w:type="spellEnd"/>
-            <w:r>
-              <w:rPr>
-                <w:rFonts w:ascii="Arial" w:hAnsi="Arial" w:cs="Arial"/>
-              </w:rPr>
-              <w:t xml:space="preserve"> </w:t>
-            </w:r>
-            <w:proofErr w:type="spellStart"/>
-            <w:r>
-              <w:rPr>
-                <w:rFonts w:ascii="Arial" w:hAnsi="Arial" w:cs="Arial"/>
-              </w:rPr>
-              <w:t>analisado</w:t>
-            </w:r>
-            <w:proofErr w:type="spellEnd"/>
+            <w:r>
+              <w:rPr>
+                <w:rFonts w:ascii="Arial" w:hAnsi="Arial" w:cs="Arial"/>
+              </w:rPr>
+              <w:t>Chamado analisado</w:t>
+            </w:r>
           </w:p>
         </w:tc>
         <w:tc>
@@ -29466,33 +28514,11 @@
                 <w:rFonts w:ascii="Arial" w:hAnsi="Arial" w:cs="Arial"/>
               </w:rPr>
             </w:pPr>
-            <w:proofErr w:type="spellStart"/>
-            <w:r>
-              <w:rPr>
-                <w:rFonts w:ascii="Arial" w:hAnsi="Arial" w:cs="Arial"/>
-              </w:rPr>
-              <w:t>Atribuição</w:t>
-            </w:r>
-            <w:proofErr w:type="spellEnd"/>
-            <w:r>
-              <w:rPr>
-                <w:rFonts w:ascii="Arial" w:hAnsi="Arial" w:cs="Arial"/>
-              </w:rPr>
-              <w:t xml:space="preserve"> </w:t>
-            </w:r>
-            <w:proofErr w:type="gramStart"/>
-            <w:r>
-              <w:rPr>
-                <w:rFonts w:ascii="Arial" w:hAnsi="Arial" w:cs="Arial"/>
-              </w:rPr>
-              <w:t>a</w:t>
-            </w:r>
-            <w:proofErr w:type="gramEnd"/>
-            <w:r>
-              <w:rPr>
-                <w:rFonts w:ascii="Arial" w:hAnsi="Arial" w:cs="Arial"/>
-              </w:rPr>
-              <w:t xml:space="preserve"> equipe</w:t>
+            <w:r>
+              <w:rPr>
+                <w:rFonts w:ascii="Arial" w:hAnsi="Arial" w:cs="Arial"/>
+              </w:rPr>
+              <w:t>Atribuição a equipe</w:t>
             </w:r>
           </w:p>
         </w:tc>
@@ -29517,16 +28543,8 @@
               <w:rPr>
                 <w:rFonts w:ascii="Arial" w:hAnsi="Arial" w:cs="Arial"/>
               </w:rPr>
-              <w:t xml:space="preserve">Status </w:t>
-            </w:r>
-            <w:proofErr w:type="spellStart"/>
-            <w:r>
-              <w:rPr>
-                <w:rFonts w:ascii="Arial" w:hAnsi="Arial" w:cs="Arial"/>
-              </w:rPr>
-              <w:t>Atribuído</w:t>
-            </w:r>
-            <w:proofErr w:type="spellEnd"/>
+              <w:t>Status Atribuído</w:t>
+            </w:r>
           </w:p>
         </w:tc>
       </w:tr>
@@ -29602,28 +28620,12 @@
                 <w:rFonts w:ascii="Arial" w:hAnsi="Arial" w:cs="Arial"/>
               </w:rPr>
             </w:pPr>
-            <w:proofErr w:type="spellStart"/>
-            <w:r>
-              <w:rPr>
-                <w:rFonts w:ascii="Arial" w:hAnsi="Arial" w:cs="Arial"/>
-              </w:rPr>
-              <w:t>Chamado</w:t>
-            </w:r>
-            <w:proofErr w:type="spellEnd"/>
-            <w:r>
-              <w:rPr>
-                <w:rFonts w:ascii="Arial" w:hAnsi="Arial" w:cs="Arial"/>
-              </w:rPr>
-              <w:t xml:space="preserve"> </w:t>
-            </w:r>
-            <w:proofErr w:type="spellStart"/>
-            <w:r>
-              <w:rPr>
-                <w:rFonts w:ascii="Arial" w:hAnsi="Arial" w:cs="Arial"/>
-              </w:rPr>
-              <w:t>atribuído</w:t>
-            </w:r>
-            <w:proofErr w:type="spellEnd"/>
+            <w:r>
+              <w:rPr>
+                <w:rFonts w:ascii="Arial" w:hAnsi="Arial" w:cs="Arial"/>
+              </w:rPr>
+              <w:t>Chamado atribuído</w:t>
+            </w:r>
           </w:p>
         </w:tc>
         <w:tc>
@@ -29674,16 +28676,8 @@
               <w:rPr>
                 <w:rFonts w:ascii="Arial" w:hAnsi="Arial" w:cs="Arial"/>
               </w:rPr>
-              <w:t xml:space="preserve">Status Em </w:t>
-            </w:r>
-            <w:proofErr w:type="spellStart"/>
-            <w:r>
-              <w:rPr>
-                <w:rFonts w:ascii="Arial" w:hAnsi="Arial" w:cs="Arial"/>
-              </w:rPr>
-              <w:t>Atendimento</w:t>
-            </w:r>
-            <w:proofErr w:type="spellEnd"/>
+              <w:t>Status Em Atendimento</w:t>
+            </w:r>
           </w:p>
         </w:tc>
       </w:tr>
@@ -29759,42 +28753,12 @@
                 <w:rFonts w:ascii="Arial" w:hAnsi="Arial" w:cs="Arial"/>
               </w:rPr>
             </w:pPr>
-            <w:proofErr w:type="spellStart"/>
-            <w:r>
-              <w:rPr>
-                <w:rFonts w:ascii="Arial" w:hAnsi="Arial" w:cs="Arial"/>
-              </w:rPr>
-              <w:t>Chamado</w:t>
-            </w:r>
-            <w:proofErr w:type="spellEnd"/>
-            <w:r>
-              <w:rPr>
-                <w:rFonts w:ascii="Arial" w:hAnsi="Arial" w:cs="Arial"/>
-              </w:rPr>
-              <w:t xml:space="preserve"> </w:t>
-            </w:r>
-            <w:proofErr w:type="spellStart"/>
-            <w:r>
-              <w:rPr>
-                <w:rFonts w:ascii="Arial" w:hAnsi="Arial" w:cs="Arial"/>
-              </w:rPr>
-              <w:t>em</w:t>
-            </w:r>
-            <w:proofErr w:type="spellEnd"/>
-            <w:r>
-              <w:rPr>
-                <w:rFonts w:ascii="Arial" w:hAnsi="Arial" w:cs="Arial"/>
-              </w:rPr>
-              <w:t xml:space="preserve"> </w:t>
-            </w:r>
-            <w:proofErr w:type="spellStart"/>
-            <w:r>
-              <w:rPr>
-                <w:rFonts w:ascii="Arial" w:hAnsi="Arial" w:cs="Arial"/>
-              </w:rPr>
-              <w:t>atendimento</w:t>
-            </w:r>
-            <w:proofErr w:type="spellEnd"/>
+            <w:r>
+              <w:rPr>
+                <w:rFonts w:ascii="Arial" w:hAnsi="Arial" w:cs="Arial"/>
+              </w:rPr>
+              <w:t>Chamado em atendimento</w:t>
+            </w:r>
           </w:p>
         </w:tc>
         <w:tc>
@@ -29814,14 +28778,12 @@
                 <w:rFonts w:ascii="Arial" w:hAnsi="Arial" w:cs="Arial"/>
               </w:rPr>
             </w:pPr>
-            <w:proofErr w:type="spellStart"/>
             <w:r>
               <w:rPr>
                 <w:rFonts w:ascii="Arial" w:hAnsi="Arial" w:cs="Arial"/>
               </w:rPr>
               <w:t>Finalização</w:t>
             </w:r>
-            <w:proofErr w:type="spellEnd"/>
           </w:p>
         </w:tc>
         <w:tc>
@@ -29845,16 +28807,8 @@
               <w:rPr>
                 <w:rFonts w:ascii="Arial" w:hAnsi="Arial" w:cs="Arial"/>
               </w:rPr>
-              <w:t xml:space="preserve">Status </w:t>
-            </w:r>
-            <w:proofErr w:type="spellStart"/>
-            <w:r>
-              <w:rPr>
-                <w:rFonts w:ascii="Arial" w:hAnsi="Arial" w:cs="Arial"/>
-              </w:rPr>
-              <w:t>Concluído</w:t>
-            </w:r>
-            <w:proofErr w:type="spellEnd"/>
+              <w:t>Status Concluído</w:t>
+            </w:r>
           </w:p>
         </w:tc>
       </w:tr>
@@ -29905,14 +28859,12 @@
                 <w:rFonts w:ascii="Arial" w:hAnsi="Arial" w:cs="Arial"/>
               </w:rPr>
             </w:pPr>
-            <w:proofErr w:type="spellStart"/>
             <w:r>
               <w:rPr>
                 <w:rFonts w:ascii="Arial" w:hAnsi="Arial" w:cs="Arial"/>
               </w:rPr>
               <w:t>Cidadão</w:t>
             </w:r>
-            <w:proofErr w:type="spellEnd"/>
           </w:p>
         </w:tc>
         <w:tc>
@@ -29932,28 +28884,12 @@
                 <w:rFonts w:ascii="Arial" w:hAnsi="Arial" w:cs="Arial"/>
               </w:rPr>
             </w:pPr>
-            <w:proofErr w:type="spellStart"/>
-            <w:r>
-              <w:rPr>
-                <w:rFonts w:ascii="Arial" w:hAnsi="Arial" w:cs="Arial"/>
-              </w:rPr>
-              <w:t>Chamado</w:t>
-            </w:r>
-            <w:proofErr w:type="spellEnd"/>
-            <w:r>
-              <w:rPr>
-                <w:rFonts w:ascii="Arial" w:hAnsi="Arial" w:cs="Arial"/>
-              </w:rPr>
-              <w:t xml:space="preserve"> </w:t>
-            </w:r>
-            <w:proofErr w:type="spellStart"/>
-            <w:r>
-              <w:rPr>
-                <w:rFonts w:ascii="Arial" w:hAnsi="Arial" w:cs="Arial"/>
-              </w:rPr>
-              <w:t>concluído</w:t>
-            </w:r>
-            <w:proofErr w:type="spellEnd"/>
+            <w:r>
+              <w:rPr>
+                <w:rFonts w:ascii="Arial" w:hAnsi="Arial" w:cs="Arial"/>
+              </w:rPr>
+              <w:t>Chamado concluído</w:t>
+            </w:r>
           </w:p>
         </w:tc>
         <w:tc>
@@ -29977,30 +28913,8 @@
               <w:rPr>
                 <w:rFonts w:ascii="Arial" w:hAnsi="Arial" w:cs="Arial"/>
               </w:rPr>
-              <w:t xml:space="preserve">Consulta das </w:t>
-            </w:r>
-            <w:proofErr w:type="spellStart"/>
-            <w:r>
-              <w:rPr>
-                <w:rFonts w:ascii="Arial" w:hAnsi="Arial" w:cs="Arial"/>
-              </w:rPr>
-              <w:t>informações</w:t>
-            </w:r>
-            <w:proofErr w:type="spellEnd"/>
-            <w:r>
-              <w:rPr>
-                <w:rFonts w:ascii="Arial" w:hAnsi="Arial" w:cs="Arial"/>
-              </w:rPr>
-              <w:t xml:space="preserve"> </w:t>
-            </w:r>
-            <w:proofErr w:type="spellStart"/>
-            <w:r>
-              <w:rPr>
-                <w:rFonts w:ascii="Arial" w:hAnsi="Arial" w:cs="Arial"/>
-              </w:rPr>
-              <w:t>permitidas</w:t>
-            </w:r>
-            <w:proofErr w:type="spellEnd"/>
+              <w:t>Consulta das informações permitidas</w:t>
+            </w:r>
           </w:p>
         </w:tc>
         <w:tc>
@@ -30062,17 +28976,8 @@
           <w:color w:val="000000" w:themeColor="text1"/>
         </w:rPr>
         <w:lastRenderedPageBreak/>
-        <w:t xml:space="preserve">6.2 Status do </w:t>
+        <w:t>6.2 Status do chamado</w:t>
       </w:r>
-      <w:proofErr w:type="spellStart"/>
-      <w:r>
-        <w:rPr>
-          <w:rFonts w:ascii="Arial" w:hAnsi="Arial" w:cs="Arial"/>
-          <w:color w:val="000000" w:themeColor="text1"/>
-        </w:rPr>
-        <w:t>chamado</w:t>
-      </w:r>
-      <w:proofErr w:type="spellEnd"/>
     </w:p>
     <w:tbl>
       <w:tblPr>
@@ -30133,31 +29038,13 @@
                 <w:rFonts w:ascii="Arial" w:hAnsi="Arial" w:cs="Arial"/>
               </w:rPr>
             </w:pPr>
-            <w:proofErr w:type="spellStart"/>
             <w:r>
               <w:rPr>
                 <w:rFonts w:ascii="Arial" w:hAnsi="Arial" w:cs="Arial"/>
                 <w:b/>
               </w:rPr>
-              <w:t>Descrição</w:t>
-            </w:r>
-            <w:proofErr w:type="spellEnd"/>
-            <w:r>
-              <w:rPr>
-                <w:rFonts w:ascii="Arial" w:hAnsi="Arial" w:cs="Arial"/>
-                <w:b/>
-              </w:rPr>
-              <w:t>/</w:t>
-            </w:r>
-            <w:proofErr w:type="spellStart"/>
-            <w:r>
-              <w:rPr>
-                <w:rFonts w:ascii="Arial" w:hAnsi="Arial" w:cs="Arial"/>
-                <w:b/>
-              </w:rPr>
-              <w:t>Contexto</w:t>
-            </w:r>
-            <w:proofErr w:type="spellEnd"/>
+              <w:t>Descrição/Contexto</w:t>
+            </w:r>
           </w:p>
         </w:tc>
       </w:tr>
@@ -30183,14 +29070,12 @@
                 <w:rFonts w:ascii="Arial" w:hAnsi="Arial" w:cs="Arial"/>
               </w:rPr>
             </w:pPr>
-            <w:proofErr w:type="spellStart"/>
             <w:r>
               <w:rPr>
                 <w:rFonts w:ascii="Arial" w:hAnsi="Arial" w:cs="Arial"/>
               </w:rPr>
               <w:t>Processamento</w:t>
             </w:r>
-            <w:proofErr w:type="spellEnd"/>
           </w:p>
         </w:tc>
         <w:tc>
@@ -30315,14 +29200,12 @@
                 <w:rFonts w:ascii="Arial" w:hAnsi="Arial" w:cs="Arial"/>
               </w:rPr>
             </w:pPr>
-            <w:proofErr w:type="spellStart"/>
             <w:r>
               <w:rPr>
                 <w:rFonts w:ascii="Arial" w:hAnsi="Arial" w:cs="Arial"/>
               </w:rPr>
               <w:t>Analisado</w:t>
             </w:r>
-            <w:proofErr w:type="spellEnd"/>
           </w:p>
         </w:tc>
         <w:tc>
@@ -30375,14 +29258,12 @@
                 <w:rFonts w:ascii="Arial" w:hAnsi="Arial" w:cs="Arial"/>
               </w:rPr>
             </w:pPr>
-            <w:proofErr w:type="spellStart"/>
             <w:r>
               <w:rPr>
                 <w:rFonts w:ascii="Arial" w:hAnsi="Arial" w:cs="Arial"/>
               </w:rPr>
               <w:t>Atribuído</w:t>
             </w:r>
-            <w:proofErr w:type="spellEnd"/>
           </w:p>
         </w:tc>
         <w:tc>
@@ -30439,16 +29320,8 @@
               <w:rPr>
                 <w:rFonts w:ascii="Arial" w:hAnsi="Arial" w:cs="Arial"/>
               </w:rPr>
-              <w:t xml:space="preserve">Em </w:t>
-            </w:r>
-            <w:proofErr w:type="spellStart"/>
-            <w:r>
-              <w:rPr>
-                <w:rFonts w:ascii="Arial" w:hAnsi="Arial" w:cs="Arial"/>
-              </w:rPr>
-              <w:t>Atendimento</w:t>
-            </w:r>
-            <w:proofErr w:type="spellEnd"/>
+              <w:t>Em Atendimento</w:t>
+            </w:r>
           </w:p>
         </w:tc>
         <w:tc>
@@ -30501,14 +29374,12 @@
                 <w:rFonts w:ascii="Arial" w:hAnsi="Arial" w:cs="Arial"/>
               </w:rPr>
             </w:pPr>
-            <w:proofErr w:type="spellStart"/>
             <w:r>
               <w:rPr>
                 <w:rFonts w:ascii="Arial" w:hAnsi="Arial" w:cs="Arial"/>
               </w:rPr>
               <w:t>Concluído</w:t>
             </w:r>
-            <w:proofErr w:type="spellEnd"/>
           </w:p>
         </w:tc>
         <w:tc>
@@ -30532,35 +29403,7 @@
               <w:rPr>
                 <w:rFonts w:ascii="Arial" w:hAnsi="Arial" w:cs="Arial"/>
               </w:rPr>
-              <w:t xml:space="preserve">Técnico </w:t>
-            </w:r>
-            <w:proofErr w:type="spellStart"/>
-            <w:r>
-              <w:rPr>
-                <w:rFonts w:ascii="Arial" w:hAnsi="Arial" w:cs="Arial"/>
-              </w:rPr>
-              <w:t>finalizou</w:t>
-            </w:r>
-            <w:proofErr w:type="spellEnd"/>
-            <w:r>
-              <w:rPr>
-                <w:rFonts w:ascii="Arial" w:hAnsi="Arial" w:cs="Arial"/>
-              </w:rPr>
-              <w:t xml:space="preserve"> o </w:t>
-            </w:r>
-            <w:proofErr w:type="spellStart"/>
-            <w:r>
-              <w:rPr>
-                <w:rFonts w:ascii="Arial" w:hAnsi="Arial" w:cs="Arial"/>
-              </w:rPr>
-              <w:t>chamado</w:t>
-            </w:r>
-            <w:proofErr w:type="spellEnd"/>
-            <w:r>
-              <w:rPr>
-                <w:rFonts w:ascii="Arial" w:hAnsi="Arial" w:cs="Arial"/>
-              </w:rPr>
-              <w:t>.</w:t>
+              <w:t>Técnico finalizou o chamado.</w:t>
             </w:r>
           </w:p>
         </w:tc>
@@ -30591,16 +29434,8 @@
               <w:rPr>
                 <w:rFonts w:ascii="Arial" w:hAnsi="Arial" w:cs="Arial"/>
               </w:rPr>
-              <w:t xml:space="preserve">Falta </w:t>
-            </w:r>
-            <w:proofErr w:type="spellStart"/>
-            <w:r>
-              <w:rPr>
-                <w:rFonts w:ascii="Arial" w:hAnsi="Arial" w:cs="Arial"/>
-              </w:rPr>
-              <w:t>Informação</w:t>
-            </w:r>
-            <w:proofErr w:type="spellEnd"/>
+              <w:t>Falta Informação</w:t>
+            </w:r>
           </w:p>
         </w:tc>
         <w:tc>
@@ -30653,14 +29488,12 @@
                 <w:rFonts w:ascii="Arial" w:hAnsi="Arial" w:cs="Arial"/>
               </w:rPr>
             </w:pPr>
-            <w:proofErr w:type="spellStart"/>
             <w:r>
               <w:rPr>
                 <w:rFonts w:ascii="Arial" w:hAnsi="Arial" w:cs="Arial"/>
               </w:rPr>
               <w:t>Cancelado</w:t>
             </w:r>
-            <w:proofErr w:type="spellEnd"/>
           </w:p>
         </w:tc>
         <w:tc>
@@ -30713,14 +29546,12 @@
                 <w:rFonts w:ascii="Arial" w:hAnsi="Arial" w:cs="Arial"/>
               </w:rPr>
             </w:pPr>
-            <w:proofErr w:type="spellStart"/>
             <w:r>
               <w:rPr>
                 <w:rFonts w:ascii="Arial" w:hAnsi="Arial" w:cs="Arial"/>
               </w:rPr>
               <w:t>Recusado</w:t>
             </w:r>
-            <w:proofErr w:type="spellEnd"/>
           </w:p>
         </w:tc>
         <w:tc>
@@ -30945,59 +29776,8 @@
           <w:sz w:val="32"/>
           <w:szCs w:val="32"/>
         </w:rPr>
-        <w:t xml:space="preserve">7. </w:t>
+        <w:t>7. Matriz resumida de permissões</w:t>
       </w:r>
-      <w:proofErr w:type="spellStart"/>
-      <w:r>
-        <w:rPr>
-          <w:rFonts w:ascii="Arial" w:hAnsi="Arial" w:cs="Arial"/>
-          <w:color w:val="000000" w:themeColor="text1"/>
-          <w:sz w:val="32"/>
-          <w:szCs w:val="32"/>
-        </w:rPr>
-        <w:t>Matriz</w:t>
-      </w:r>
-      <w:proofErr w:type="spellEnd"/>
-      <w:r>
-        <w:rPr>
-          <w:rFonts w:ascii="Arial" w:hAnsi="Arial" w:cs="Arial"/>
-          <w:color w:val="000000" w:themeColor="text1"/>
-          <w:sz w:val="32"/>
-          <w:szCs w:val="32"/>
-        </w:rPr>
-        <w:t xml:space="preserve"> </w:t>
-      </w:r>
-      <w:proofErr w:type="spellStart"/>
-      <w:r>
-        <w:rPr>
-          <w:rFonts w:ascii="Arial" w:hAnsi="Arial" w:cs="Arial"/>
-          <w:color w:val="000000" w:themeColor="text1"/>
-          <w:sz w:val="32"/>
-          <w:szCs w:val="32"/>
-        </w:rPr>
-        <w:t>resumida</w:t>
-      </w:r>
-      <w:proofErr w:type="spellEnd"/>
-      <w:r>
-        <w:rPr>
-          <w:rFonts w:ascii="Arial" w:hAnsi="Arial" w:cs="Arial"/>
-          <w:color w:val="000000" w:themeColor="text1"/>
-          <w:sz w:val="32"/>
-          <w:szCs w:val="32"/>
-        </w:rPr>
-        <w:t xml:space="preserve"> de </w:t>
-      </w:r>
-      <w:proofErr w:type="spellStart"/>
-      <w:r>
-        <w:rPr>
-          <w:rFonts w:ascii="Arial" w:hAnsi="Arial" w:cs="Arial"/>
-          <w:color w:val="000000" w:themeColor="text1"/>
-          <w:sz w:val="32"/>
-          <w:szCs w:val="32"/>
-        </w:rPr>
-        <w:t>permissões</w:t>
-      </w:r>
-      <w:proofErr w:type="spellEnd"/>
     </w:p>
     <w:p>
       <w:pPr>
@@ -31043,7 +29823,6 @@
                 <w:rFonts w:ascii="Arial" w:hAnsi="Arial" w:cs="Arial"/>
               </w:rPr>
             </w:pPr>
-            <w:proofErr w:type="spellStart"/>
             <w:r>
               <w:rPr>
                 <w:rFonts w:ascii="Arial" w:hAnsi="Arial" w:cs="Arial"/>
@@ -31051,7 +29830,6 @@
               </w:rPr>
               <w:t>Funcionalidade</w:t>
             </w:r>
-            <w:proofErr w:type="spellEnd"/>
           </w:p>
         </w:tc>
         <w:tc>
@@ -31071,7 +29849,6 @@
                 <w:rFonts w:ascii="Arial" w:hAnsi="Arial" w:cs="Arial"/>
               </w:rPr>
             </w:pPr>
-            <w:proofErr w:type="spellStart"/>
             <w:r>
               <w:rPr>
                 <w:rFonts w:ascii="Arial" w:hAnsi="Arial" w:cs="Arial"/>
@@ -31079,7 +29856,6 @@
               </w:rPr>
               <w:t>Cidadão</w:t>
             </w:r>
-            <w:proofErr w:type="spellEnd"/>
           </w:p>
         </w:tc>
         <w:tc>
@@ -31130,17 +29906,34 @@
                 <w:rFonts w:ascii="Arial" w:hAnsi="Arial" w:cs="Arial"/>
                 <w:b/>
               </w:rPr>
-              <w:t xml:space="preserve">Gestor </w:t>
-            </w:r>
-            <w:proofErr w:type="spellStart"/>
+              <w:t>Gestor Comum</w:t>
+            </w:r>
+          </w:p>
+        </w:tc>
+        <w:tc>
+          <w:tcPr>
+            <w:tcW w:w="1440" w:type="dxa"/>
+            <w:tcBorders>
+              <w:top w:val="single" w:sz="4" w:space="0" w:color="000000"/>
+              <w:left w:val="single" w:sz="4" w:space="0" w:color="000000"/>
+              <w:bottom w:val="single" w:sz="4" w:space="0" w:color="000000"/>
+              <w:right w:val="single" w:sz="4" w:space="0" w:color="000000"/>
+            </w:tcBorders>
+            <w:vAlign w:val="center"/>
+          </w:tcPr>
+          <w:p>
+            <w:pPr>
+              <w:rPr>
+                <w:rFonts w:ascii="Arial" w:hAnsi="Arial" w:cs="Arial"/>
+              </w:rPr>
+            </w:pPr>
             <w:r>
               <w:rPr>
                 <w:rFonts w:ascii="Arial" w:hAnsi="Arial" w:cs="Arial"/>
                 <w:b/>
               </w:rPr>
-              <w:t>Comum</w:t>
-            </w:r>
-            <w:proofErr w:type="spellEnd"/>
+              <w:t>Gestor Unidade</w:t>
+            </w:r>
           </w:p>
         </w:tc>
         <w:tc>
@@ -31165,52 +29958,8 @@
                 <w:rFonts w:ascii="Arial" w:hAnsi="Arial" w:cs="Arial"/>
                 <w:b/>
               </w:rPr>
-              <w:t xml:space="preserve">Gestor </w:t>
-            </w:r>
-            <w:proofErr w:type="spellStart"/>
-            <w:r>
-              <w:rPr>
-                <w:rFonts w:ascii="Arial" w:hAnsi="Arial" w:cs="Arial"/>
-                <w:b/>
-              </w:rPr>
-              <w:t>Unidade</w:t>
-            </w:r>
-            <w:proofErr w:type="spellEnd"/>
-          </w:p>
-        </w:tc>
-        <w:tc>
-          <w:tcPr>
-            <w:tcW w:w="1440" w:type="dxa"/>
-            <w:tcBorders>
-              <w:top w:val="single" w:sz="4" w:space="0" w:color="000000"/>
-              <w:left w:val="single" w:sz="4" w:space="0" w:color="000000"/>
-              <w:bottom w:val="single" w:sz="4" w:space="0" w:color="000000"/>
-              <w:right w:val="single" w:sz="4" w:space="0" w:color="000000"/>
-            </w:tcBorders>
-            <w:vAlign w:val="center"/>
-          </w:tcPr>
-          <w:p>
-            <w:pPr>
-              <w:rPr>
-                <w:rFonts w:ascii="Arial" w:hAnsi="Arial" w:cs="Arial"/>
-              </w:rPr>
-            </w:pPr>
-            <w:r>
-              <w:rPr>
-                <w:rFonts w:ascii="Arial" w:hAnsi="Arial" w:cs="Arial"/>
-                <w:b/>
-              </w:rPr>
-              <w:t xml:space="preserve">Admin. </w:t>
-            </w:r>
-            <w:proofErr w:type="spellStart"/>
-            <w:r>
-              <w:rPr>
-                <w:rFonts w:ascii="Arial" w:hAnsi="Arial" w:cs="Arial"/>
-                <w:b/>
-              </w:rPr>
-              <w:t>Geral</w:t>
-            </w:r>
-            <w:proofErr w:type="spellEnd"/>
+              <w:t>Admin. Geral</w:t>
+            </w:r>
           </w:p>
         </w:tc>
       </w:tr>
@@ -31236,28 +29985,12 @@
                 <w:rFonts w:ascii="Arial" w:hAnsi="Arial" w:cs="Arial"/>
               </w:rPr>
             </w:pPr>
-            <w:proofErr w:type="spellStart"/>
-            <w:r>
-              <w:rPr>
-                <w:rFonts w:ascii="Arial" w:hAnsi="Arial" w:cs="Arial"/>
-              </w:rPr>
-              <w:t>Criar</w:t>
-            </w:r>
-            <w:proofErr w:type="spellEnd"/>
-            <w:r>
-              <w:rPr>
-                <w:rFonts w:ascii="Arial" w:hAnsi="Arial" w:cs="Arial"/>
-              </w:rPr>
-              <w:t xml:space="preserve"> </w:t>
-            </w:r>
-            <w:proofErr w:type="spellStart"/>
-            <w:r>
-              <w:rPr>
-                <w:rFonts w:ascii="Arial" w:hAnsi="Arial" w:cs="Arial"/>
-              </w:rPr>
-              <w:t>chamado</w:t>
-            </w:r>
-            <w:proofErr w:type="spellEnd"/>
+            <w:r>
+              <w:rPr>
+                <w:rFonts w:ascii="Arial" w:hAnsi="Arial" w:cs="Arial"/>
+              </w:rPr>
+              <w:t>Criar chamado</w:t>
+            </w:r>
           </w:p>
         </w:tc>
         <w:tc>
@@ -31408,28 +30141,12 @@
                 <w:rFonts w:ascii="Arial" w:hAnsi="Arial" w:cs="Arial"/>
               </w:rPr>
             </w:pPr>
-            <w:proofErr w:type="spellStart"/>
-            <w:r>
-              <w:rPr>
-                <w:rFonts w:ascii="Arial" w:hAnsi="Arial" w:cs="Arial"/>
-              </w:rPr>
-              <w:t>Acompanhar</w:t>
-            </w:r>
-            <w:proofErr w:type="spellEnd"/>
-            <w:r>
-              <w:rPr>
-                <w:rFonts w:ascii="Arial" w:hAnsi="Arial" w:cs="Arial"/>
-              </w:rPr>
-              <w:t xml:space="preserve"> </w:t>
-            </w:r>
-            <w:proofErr w:type="spellStart"/>
-            <w:r>
-              <w:rPr>
-                <w:rFonts w:ascii="Arial" w:hAnsi="Arial" w:cs="Arial"/>
-              </w:rPr>
-              <w:t>chamado</w:t>
-            </w:r>
-            <w:proofErr w:type="spellEnd"/>
+            <w:r>
+              <w:rPr>
+                <w:rFonts w:ascii="Arial" w:hAnsi="Arial" w:cs="Arial"/>
+              </w:rPr>
+              <w:t>Acompanhar chamado</w:t>
+            </w:r>
           </w:p>
         </w:tc>
         <w:tc>
@@ -31580,33 +30297,11 @@
                 <w:rFonts w:ascii="Arial" w:hAnsi="Arial" w:cs="Arial"/>
               </w:rPr>
             </w:pPr>
-            <w:proofErr w:type="spellStart"/>
-            <w:r>
-              <w:rPr>
-                <w:rFonts w:ascii="Arial" w:hAnsi="Arial" w:cs="Arial"/>
-              </w:rPr>
-              <w:t>Editar</w:t>
-            </w:r>
-            <w:proofErr w:type="spellEnd"/>
-            <w:r>
-              <w:rPr>
-                <w:rFonts w:ascii="Arial" w:hAnsi="Arial" w:cs="Arial"/>
-              </w:rPr>
-              <w:t xml:space="preserve"> </w:t>
-            </w:r>
-            <w:proofErr w:type="spellStart"/>
-            <w:r>
-              <w:rPr>
-                <w:rFonts w:ascii="Arial" w:hAnsi="Arial" w:cs="Arial"/>
-              </w:rPr>
-              <w:t>chamado</w:t>
-            </w:r>
-            <w:proofErr w:type="spellEnd"/>
-            <w:r>
-              <w:rPr>
-                <w:rFonts w:ascii="Arial" w:hAnsi="Arial" w:cs="Arial"/>
-              </w:rPr>
-              <w:t xml:space="preserve"> Pendente</w:t>
+            <w:r>
+              <w:rPr>
+                <w:rFonts w:ascii="Arial" w:hAnsi="Arial" w:cs="Arial"/>
+              </w:rPr>
+              <w:t>Editar chamado Pendente</w:t>
             </w:r>
           </w:p>
         </w:tc>
@@ -31758,42 +30453,12 @@
                 <w:rFonts w:ascii="Arial" w:hAnsi="Arial" w:cs="Arial"/>
               </w:rPr>
             </w:pPr>
-            <w:proofErr w:type="spellStart"/>
-            <w:r>
-              <w:rPr>
-                <w:rFonts w:ascii="Arial" w:hAnsi="Arial" w:cs="Arial"/>
-              </w:rPr>
-              <w:t>Editar</w:t>
-            </w:r>
-            <w:proofErr w:type="spellEnd"/>
-            <w:r>
-              <w:rPr>
-                <w:rFonts w:ascii="Arial" w:hAnsi="Arial" w:cs="Arial"/>
-              </w:rPr>
-              <w:t xml:space="preserve"> </w:t>
-            </w:r>
-            <w:proofErr w:type="spellStart"/>
-            <w:r>
-              <w:rPr>
-                <w:rFonts w:ascii="Arial" w:hAnsi="Arial" w:cs="Arial"/>
-              </w:rPr>
-              <w:t>chamado</w:t>
-            </w:r>
-            <w:proofErr w:type="spellEnd"/>
-            <w:r>
-              <w:rPr>
-                <w:rFonts w:ascii="Arial" w:hAnsi="Arial" w:cs="Arial"/>
-              </w:rPr>
-              <w:t xml:space="preserve"> Falta </w:t>
-            </w:r>
-            <w:proofErr w:type="spellStart"/>
-            <w:r>
-              <w:rPr>
-                <w:rFonts w:ascii="Arial" w:hAnsi="Arial" w:cs="Arial"/>
-              </w:rPr>
-              <w:t>Informação</w:t>
-            </w:r>
-            <w:proofErr w:type="spellEnd"/>
+            <w:r>
+              <w:rPr>
+                <w:rFonts w:ascii="Arial" w:hAnsi="Arial" w:cs="Arial"/>
+              </w:rPr>
+              <w:t>Editar chamado Falta Informação</w:t>
+            </w:r>
           </w:p>
         </w:tc>
         <w:tc>
@@ -31944,28 +30609,12 @@
                 <w:rFonts w:ascii="Arial" w:hAnsi="Arial" w:cs="Arial"/>
               </w:rPr>
             </w:pPr>
-            <w:proofErr w:type="spellStart"/>
-            <w:r>
-              <w:rPr>
-                <w:rFonts w:ascii="Arial" w:hAnsi="Arial" w:cs="Arial"/>
-              </w:rPr>
-              <w:t>Analisar</w:t>
-            </w:r>
-            <w:proofErr w:type="spellEnd"/>
-            <w:r>
-              <w:rPr>
-                <w:rFonts w:ascii="Arial" w:hAnsi="Arial" w:cs="Arial"/>
-              </w:rPr>
-              <w:t xml:space="preserve"> </w:t>
-            </w:r>
-            <w:proofErr w:type="spellStart"/>
-            <w:r>
-              <w:rPr>
-                <w:rFonts w:ascii="Arial" w:hAnsi="Arial" w:cs="Arial"/>
-              </w:rPr>
-              <w:t>chamado</w:t>
-            </w:r>
-            <w:proofErr w:type="spellEnd"/>
+            <w:r>
+              <w:rPr>
+                <w:rFonts w:ascii="Arial" w:hAnsi="Arial" w:cs="Arial"/>
+              </w:rPr>
+              <w:t>Analisar chamado</w:t>
+            </w:r>
           </w:p>
         </w:tc>
         <w:tc>
@@ -32116,19 +30765,11 @@
                 <w:rFonts w:ascii="Arial" w:hAnsi="Arial" w:cs="Arial"/>
               </w:rPr>
             </w:pPr>
-            <w:proofErr w:type="spellStart"/>
-            <w:r>
-              <w:rPr>
-                <w:rFonts w:ascii="Arial" w:hAnsi="Arial" w:cs="Arial"/>
-              </w:rPr>
-              <w:t>Atribuir</w:t>
-            </w:r>
-            <w:proofErr w:type="spellEnd"/>
-            <w:r>
-              <w:rPr>
-                <w:rFonts w:ascii="Arial" w:hAnsi="Arial" w:cs="Arial"/>
-              </w:rPr>
-              <w:t xml:space="preserve"> equipe</w:t>
+            <w:r>
+              <w:rPr>
+                <w:rFonts w:ascii="Arial" w:hAnsi="Arial" w:cs="Arial"/>
+              </w:rPr>
+              <w:t>Atribuir equipe</w:t>
             </w:r>
           </w:p>
         </w:tc>
@@ -32280,28 +30921,12 @@
                 <w:rFonts w:ascii="Arial" w:hAnsi="Arial" w:cs="Arial"/>
               </w:rPr>
             </w:pPr>
-            <w:proofErr w:type="spellStart"/>
-            <w:r>
-              <w:rPr>
-                <w:rFonts w:ascii="Arial" w:hAnsi="Arial" w:cs="Arial"/>
-              </w:rPr>
-              <w:t>Iniciar</w:t>
-            </w:r>
-            <w:proofErr w:type="spellEnd"/>
-            <w:r>
-              <w:rPr>
-                <w:rFonts w:ascii="Arial" w:hAnsi="Arial" w:cs="Arial"/>
-              </w:rPr>
-              <w:t xml:space="preserve"> </w:t>
-            </w:r>
-            <w:proofErr w:type="spellStart"/>
-            <w:r>
-              <w:rPr>
-                <w:rFonts w:ascii="Arial" w:hAnsi="Arial" w:cs="Arial"/>
-              </w:rPr>
-              <w:t>atendimento</w:t>
-            </w:r>
-            <w:proofErr w:type="spellEnd"/>
+            <w:r>
+              <w:rPr>
+                <w:rFonts w:ascii="Arial" w:hAnsi="Arial" w:cs="Arial"/>
+              </w:rPr>
+              <w:t>Iniciar atendimento</w:t>
+            </w:r>
           </w:p>
         </w:tc>
         <w:tc>
@@ -32452,28 +31077,12 @@
                 <w:rFonts w:ascii="Arial" w:hAnsi="Arial" w:cs="Arial"/>
               </w:rPr>
             </w:pPr>
-            <w:proofErr w:type="spellStart"/>
-            <w:r>
-              <w:rPr>
-                <w:rFonts w:ascii="Arial" w:hAnsi="Arial" w:cs="Arial"/>
-              </w:rPr>
-              <w:t>Inserir</w:t>
-            </w:r>
-            <w:proofErr w:type="spellEnd"/>
-            <w:r>
-              <w:rPr>
-                <w:rFonts w:ascii="Arial" w:hAnsi="Arial" w:cs="Arial"/>
-              </w:rPr>
-              <w:t xml:space="preserve"> </w:t>
-            </w:r>
-            <w:proofErr w:type="spellStart"/>
-            <w:r>
-              <w:rPr>
-                <w:rFonts w:ascii="Arial" w:hAnsi="Arial" w:cs="Arial"/>
-              </w:rPr>
-              <w:t>atividade</w:t>
-            </w:r>
-            <w:proofErr w:type="spellEnd"/>
+            <w:r>
+              <w:rPr>
+                <w:rFonts w:ascii="Arial" w:hAnsi="Arial" w:cs="Arial"/>
+              </w:rPr>
+              <w:t>Inserir atividade</w:t>
+            </w:r>
           </w:p>
         </w:tc>
         <w:tc>
@@ -32624,28 +31233,12 @@
                 <w:rFonts w:ascii="Arial" w:hAnsi="Arial" w:cs="Arial"/>
               </w:rPr>
             </w:pPr>
-            <w:proofErr w:type="spellStart"/>
-            <w:r>
-              <w:rPr>
-                <w:rFonts w:ascii="Arial" w:hAnsi="Arial" w:cs="Arial"/>
-              </w:rPr>
-              <w:t>Concluir</w:t>
-            </w:r>
-            <w:proofErr w:type="spellEnd"/>
-            <w:r>
-              <w:rPr>
-                <w:rFonts w:ascii="Arial" w:hAnsi="Arial" w:cs="Arial"/>
-              </w:rPr>
-              <w:t xml:space="preserve"> </w:t>
-            </w:r>
-            <w:proofErr w:type="spellStart"/>
-            <w:r>
-              <w:rPr>
-                <w:rFonts w:ascii="Arial" w:hAnsi="Arial" w:cs="Arial"/>
-              </w:rPr>
-              <w:t>chamado</w:t>
-            </w:r>
-            <w:proofErr w:type="spellEnd"/>
+            <w:r>
+              <w:rPr>
+                <w:rFonts w:ascii="Arial" w:hAnsi="Arial" w:cs="Arial"/>
+              </w:rPr>
+              <w:t>Concluir chamado</w:t>
+            </w:r>
           </w:p>
         </w:tc>
         <w:tc>
@@ -32800,30 +31393,8 @@
               <w:rPr>
                 <w:rFonts w:ascii="Arial" w:hAnsi="Arial" w:cs="Arial"/>
               </w:rPr>
-              <w:t xml:space="preserve">Ver </w:t>
-            </w:r>
-            <w:proofErr w:type="spellStart"/>
-            <w:r>
-              <w:rPr>
-                <w:rFonts w:ascii="Arial" w:hAnsi="Arial" w:cs="Arial"/>
-              </w:rPr>
-              <w:t>todas</w:t>
-            </w:r>
-            <w:proofErr w:type="spellEnd"/>
-            <w:r>
-              <w:rPr>
-                <w:rFonts w:ascii="Arial" w:hAnsi="Arial" w:cs="Arial"/>
-              </w:rPr>
-              <w:t xml:space="preserve"> as </w:t>
-            </w:r>
-            <w:proofErr w:type="spellStart"/>
-            <w:r>
-              <w:rPr>
-                <w:rFonts w:ascii="Arial" w:hAnsi="Arial" w:cs="Arial"/>
-              </w:rPr>
-              <w:t>atividades</w:t>
-            </w:r>
-            <w:proofErr w:type="spellEnd"/>
+              <w:t>Ver todas as atividades</w:t>
+            </w:r>
           </w:p>
         </w:tc>
         <w:tc>
@@ -32843,28 +31414,12 @@
                 <w:rFonts w:ascii="Arial" w:hAnsi="Arial" w:cs="Arial"/>
               </w:rPr>
             </w:pPr>
-            <w:proofErr w:type="spellStart"/>
             <w:r>
               <w:rPr>
                 <w:rFonts w:ascii="Segoe UI Symbol" w:hAnsi="Segoe UI Symbol" w:cs="Segoe UI Symbol"/>
               </w:rPr>
-              <w:t>Conforme</w:t>
-            </w:r>
-            <w:proofErr w:type="spellEnd"/>
-            <w:r>
-              <w:rPr>
-                <w:rFonts w:ascii="Segoe UI Symbol" w:hAnsi="Segoe UI Symbol" w:cs="Segoe UI Symbol"/>
-              </w:rPr>
-              <w:t xml:space="preserve"> </w:t>
-            </w:r>
-            <w:proofErr w:type="spellStart"/>
-            <w:r>
-              <w:rPr>
-                <w:rFonts w:ascii="Segoe UI Symbol" w:hAnsi="Segoe UI Symbol" w:cs="Segoe UI Symbol"/>
-              </w:rPr>
-              <w:t>permissão</w:t>
-            </w:r>
-            <w:proofErr w:type="spellEnd"/>
+              <w:t>Conforme permissão</w:t>
+            </w:r>
           </w:p>
         </w:tc>
         <w:tc>
@@ -32884,28 +31439,12 @@
                 <w:rFonts w:ascii="Arial" w:hAnsi="Arial" w:cs="Arial"/>
               </w:rPr>
             </w:pPr>
-            <w:proofErr w:type="spellStart"/>
-            <w:r>
-              <w:rPr>
-                <w:rFonts w:ascii="Arial" w:hAnsi="Arial" w:cs="Arial"/>
-              </w:rPr>
-              <w:t>Conforme</w:t>
-            </w:r>
-            <w:proofErr w:type="spellEnd"/>
-            <w:r>
-              <w:rPr>
-                <w:rFonts w:ascii="Arial" w:hAnsi="Arial" w:cs="Arial"/>
-              </w:rPr>
-              <w:t xml:space="preserve"> </w:t>
-            </w:r>
-            <w:proofErr w:type="spellStart"/>
-            <w:r>
-              <w:rPr>
-                <w:rFonts w:ascii="Arial" w:hAnsi="Arial" w:cs="Arial"/>
-              </w:rPr>
-              <w:t>acesso</w:t>
-            </w:r>
-            <w:proofErr w:type="spellEnd"/>
+            <w:r>
+              <w:rPr>
+                <w:rFonts w:ascii="Arial" w:hAnsi="Arial" w:cs="Arial"/>
+              </w:rPr>
+              <w:t>Conforme acesso</w:t>
+            </w:r>
           </w:p>
         </w:tc>
         <w:tc>
@@ -33006,19 +31545,11 @@
                 <w:rFonts w:ascii="Arial" w:hAnsi="Arial" w:cs="Arial"/>
               </w:rPr>
             </w:pPr>
-            <w:proofErr w:type="spellStart"/>
-            <w:r>
-              <w:rPr>
-                <w:rFonts w:ascii="Arial" w:hAnsi="Arial" w:cs="Arial"/>
-              </w:rPr>
-              <w:t>Gerenciar</w:t>
-            </w:r>
-            <w:proofErr w:type="spellEnd"/>
-            <w:r>
-              <w:rPr>
-                <w:rFonts w:ascii="Arial" w:hAnsi="Arial" w:cs="Arial"/>
-              </w:rPr>
-              <w:t xml:space="preserve"> equipes</w:t>
+            <w:r>
+              <w:rPr>
+                <w:rFonts w:ascii="Arial" w:hAnsi="Arial" w:cs="Arial"/>
+              </w:rPr>
+              <w:t>Gerenciar equipes</w:t>
             </w:r>
           </w:p>
         </w:tc>
@@ -33170,28 +31701,12 @@
                 <w:rFonts w:ascii="Arial" w:hAnsi="Arial" w:cs="Arial"/>
               </w:rPr>
             </w:pPr>
-            <w:proofErr w:type="spellStart"/>
-            <w:r>
-              <w:rPr>
-                <w:rFonts w:ascii="Arial" w:hAnsi="Arial" w:cs="Arial"/>
-              </w:rPr>
-              <w:t>Gerenciar</w:t>
-            </w:r>
-            <w:proofErr w:type="spellEnd"/>
-            <w:r>
-              <w:rPr>
-                <w:rFonts w:ascii="Arial" w:hAnsi="Arial" w:cs="Arial"/>
-              </w:rPr>
-              <w:t xml:space="preserve"> </w:t>
-            </w:r>
-            <w:proofErr w:type="spellStart"/>
-            <w:r>
-              <w:rPr>
-                <w:rFonts w:ascii="Arial" w:hAnsi="Arial" w:cs="Arial"/>
-              </w:rPr>
-              <w:t>cidadãos</w:t>
-            </w:r>
-            <w:proofErr w:type="spellEnd"/>
+            <w:r>
+              <w:rPr>
+                <w:rFonts w:ascii="Arial" w:hAnsi="Arial" w:cs="Arial"/>
+              </w:rPr>
+              <w:t>Gerenciar cidadãos</w:t>
+            </w:r>
           </w:p>
         </w:tc>
         <w:tc>
@@ -33342,28 +31857,12 @@
                 <w:rFonts w:ascii="Arial" w:hAnsi="Arial" w:cs="Arial"/>
               </w:rPr>
             </w:pPr>
-            <w:proofErr w:type="spellStart"/>
-            <w:r>
-              <w:rPr>
-                <w:rFonts w:ascii="Arial" w:hAnsi="Arial" w:cs="Arial"/>
-              </w:rPr>
-              <w:t>Gerenciar</w:t>
-            </w:r>
-            <w:proofErr w:type="spellEnd"/>
-            <w:r>
-              <w:rPr>
-                <w:rFonts w:ascii="Arial" w:hAnsi="Arial" w:cs="Arial"/>
-              </w:rPr>
-              <w:t xml:space="preserve"> </w:t>
-            </w:r>
-            <w:proofErr w:type="spellStart"/>
-            <w:r>
-              <w:rPr>
-                <w:rFonts w:ascii="Arial" w:hAnsi="Arial" w:cs="Arial"/>
-              </w:rPr>
-              <w:t>técnicos</w:t>
-            </w:r>
-            <w:proofErr w:type="spellEnd"/>
+            <w:r>
+              <w:rPr>
+                <w:rFonts w:ascii="Arial" w:hAnsi="Arial" w:cs="Arial"/>
+              </w:rPr>
+              <w:t>Gerenciar técnicos</w:t>
+            </w:r>
           </w:p>
         </w:tc>
         <w:tc>
@@ -33514,28 +32013,12 @@
                 <w:rFonts w:ascii="Arial" w:hAnsi="Arial" w:cs="Arial"/>
               </w:rPr>
             </w:pPr>
-            <w:proofErr w:type="spellStart"/>
-            <w:r>
-              <w:rPr>
-                <w:rFonts w:ascii="Arial" w:hAnsi="Arial" w:cs="Arial"/>
-              </w:rPr>
-              <w:t>Gerenciar</w:t>
-            </w:r>
-            <w:proofErr w:type="spellEnd"/>
-            <w:r>
-              <w:rPr>
-                <w:rFonts w:ascii="Arial" w:hAnsi="Arial" w:cs="Arial"/>
-              </w:rPr>
-              <w:t xml:space="preserve"> </w:t>
-            </w:r>
-            <w:proofErr w:type="spellStart"/>
-            <w:r>
-              <w:rPr>
-                <w:rFonts w:ascii="Arial" w:hAnsi="Arial" w:cs="Arial"/>
-              </w:rPr>
-              <w:t>gestores</w:t>
-            </w:r>
-            <w:proofErr w:type="spellEnd"/>
+            <w:r>
+              <w:rPr>
+                <w:rFonts w:ascii="Arial" w:hAnsi="Arial" w:cs="Arial"/>
+              </w:rPr>
+              <w:t>Gerenciar gestores</w:t>
+            </w:r>
           </w:p>
         </w:tc>
         <w:tc>
@@ -33686,28 +32169,12 @@
                 <w:rFonts w:ascii="Arial" w:hAnsi="Arial" w:cs="Arial"/>
               </w:rPr>
             </w:pPr>
-            <w:proofErr w:type="spellStart"/>
-            <w:r>
-              <w:rPr>
-                <w:rFonts w:ascii="Arial" w:hAnsi="Arial" w:cs="Arial"/>
-              </w:rPr>
-              <w:t>Gerenciar</w:t>
-            </w:r>
-            <w:proofErr w:type="spellEnd"/>
-            <w:r>
-              <w:rPr>
-                <w:rFonts w:ascii="Arial" w:hAnsi="Arial" w:cs="Arial"/>
-              </w:rPr>
-              <w:t xml:space="preserve"> </w:t>
-            </w:r>
-            <w:proofErr w:type="spellStart"/>
-            <w:r>
-              <w:rPr>
-                <w:rFonts w:ascii="Arial" w:hAnsi="Arial" w:cs="Arial"/>
-              </w:rPr>
-              <w:t>departamentos</w:t>
-            </w:r>
-            <w:proofErr w:type="spellEnd"/>
+            <w:r>
+              <w:rPr>
+                <w:rFonts w:ascii="Arial" w:hAnsi="Arial" w:cs="Arial"/>
+              </w:rPr>
+              <w:t>Gerenciar departamentos</w:t>
+            </w:r>
           </w:p>
         </w:tc>
         <w:tc>
@@ -34017,21 +32484,18 @@
                 <w:rFonts w:ascii="Arial" w:hAnsi="Arial" w:cs="Arial"/>
               </w:rPr>
             </w:pPr>
-            <w:proofErr w:type="spellStart"/>
             <w:r>
               <w:rPr>
                 <w:rFonts w:ascii="Arial" w:hAnsi="Arial" w:cs="Arial"/>
               </w:rPr>
               <w:t>Gerenciar</w:t>
             </w:r>
-            <w:proofErr w:type="spellEnd"/>
             <w:r>
               <w:rPr>
                 <w:rFonts w:ascii="Arial" w:hAnsi="Arial" w:cs="Arial"/>
               </w:rPr>
               <w:t xml:space="preserve"> </w:t>
             </w:r>
-            <w:proofErr w:type="spellStart"/>
             <w:r>
               <w:rPr>
                 <w:rFonts w:ascii="Arial" w:hAnsi="Arial" w:cs="Arial"/>
@@ -34050,7 +32514,6 @@
               </w:rPr>
               <w:t>es</w:t>
             </w:r>
-            <w:proofErr w:type="spellEnd"/>
             <w:r>
               <w:rPr>
                 <w:rFonts w:ascii="Arial" w:hAnsi="Arial" w:cs="Arial"/>
@@ -34231,39 +32694,8 @@
           <w:sz w:val="32"/>
           <w:szCs w:val="32"/>
         </w:rPr>
-        <w:t xml:space="preserve">8. </w:t>
+        <w:t>8. Tecnologias utilizadas</w:t>
       </w:r>
-      <w:proofErr w:type="spellStart"/>
-      <w:r>
-        <w:rPr>
-          <w:rFonts w:ascii="Arial" w:hAnsi="Arial" w:cs="Arial"/>
-          <w:color w:val="000000" w:themeColor="text1"/>
-          <w:sz w:val="32"/>
-          <w:szCs w:val="32"/>
-        </w:rPr>
-        <w:t>Tecnologias</w:t>
-      </w:r>
-      <w:proofErr w:type="spellEnd"/>
-      <w:r>
-        <w:rPr>
-          <w:rFonts w:ascii="Arial" w:hAnsi="Arial" w:cs="Arial"/>
-          <w:color w:val="000000" w:themeColor="text1"/>
-          <w:sz w:val="32"/>
-          <w:szCs w:val="32"/>
-        </w:rPr>
-        <w:t xml:space="preserve"> </w:t>
-      </w:r>
-      <w:proofErr w:type="spellStart"/>
-      <w:r>
-        <w:rPr>
-          <w:rFonts w:ascii="Arial" w:hAnsi="Arial" w:cs="Arial"/>
-          <w:color w:val="000000" w:themeColor="text1"/>
-          <w:sz w:val="32"/>
-          <w:szCs w:val="32"/>
-        </w:rPr>
-        <w:t>utilizadas</w:t>
-      </w:r>
-      <w:proofErr w:type="spellEnd"/>
     </w:p>
     <w:p>
       <w:pPr>
@@ -34304,7 +32736,6 @@
                 <w:rFonts w:ascii="Arial" w:hAnsi="Arial" w:cs="Arial"/>
               </w:rPr>
             </w:pPr>
-            <w:proofErr w:type="spellStart"/>
             <w:r>
               <w:rPr>
                 <w:rFonts w:ascii="Arial" w:hAnsi="Arial" w:cs="Arial"/>
@@ -34312,7 +32743,6 @@
               </w:rPr>
               <w:t>Tecnologia</w:t>
             </w:r>
-            <w:proofErr w:type="spellEnd"/>
           </w:p>
         </w:tc>
         <w:tc>
@@ -34332,7 +32762,6 @@
                 <w:rFonts w:ascii="Arial" w:hAnsi="Arial" w:cs="Arial"/>
               </w:rPr>
             </w:pPr>
-            <w:proofErr w:type="spellStart"/>
             <w:r>
               <w:rPr>
                 <w:rFonts w:ascii="Arial" w:hAnsi="Arial" w:cs="Arial"/>
@@ -34340,7 +32769,6 @@
               </w:rPr>
               <w:t>Aplicação</w:t>
             </w:r>
-            <w:proofErr w:type="spellEnd"/>
           </w:p>
         </w:tc>
       </w:tr>
@@ -34569,21 +32997,7 @@
               <w:rPr>
                 <w:rFonts w:ascii="Arial" w:hAnsi="Arial" w:cs="Arial"/>
               </w:rPr>
-              <w:t xml:space="preserve">Banco de dados </w:t>
-            </w:r>
-            <w:proofErr w:type="spellStart"/>
-            <w:r>
-              <w:rPr>
-                <w:rFonts w:ascii="Arial" w:hAnsi="Arial" w:cs="Arial"/>
-              </w:rPr>
-              <w:t>relacional</w:t>
-            </w:r>
-            <w:proofErr w:type="spellEnd"/>
-            <w:r>
-              <w:rPr>
-                <w:rFonts w:ascii="Arial" w:hAnsi="Arial" w:cs="Arial"/>
-              </w:rPr>
-              <w:t>.</w:t>
+              <w:t>Banco de dados relacional.</w:t>
             </w:r>
           </w:p>
         </w:tc>

</xml_diff>